<commit_message>
docs: remove interlinear glosses, retain Logos translation note, and fix diagram layout in John 1:1-5 monograph
</commit_message>
<xml_diff>
--- a/docs/John_1_1-5_Logos_Interlinear_and_Philosophy_Thomas_Riebl.docx
+++ b/docs/John_1_1-5_Logos_Interlinear_and_Philosophy_Thomas_Riebl.docx
@@ -2,13 +2,13 @@
 <file path=word/document.xml><?xml version="1.0" encoding="utf-8"?>
 <w:document xmlns:w="http://schemas.openxmlformats.org/wordprocessingml/2006/main" xmlns:m="http://schemas.openxmlformats.org/officeDocument/2006/math" xmlns:r="http://schemas.openxmlformats.org/officeDocument/2006/relationships" xmlns:o="urn:schemas-microsoft-com:office:office" xmlns:v="urn:schemas-microsoft-com:vml" xmlns:w10="urn:schemas-microsoft-com:office:word" xmlns:a="http://schemas.openxmlformats.org/drawingml/2006/main" xmlns:pic="http://schemas.openxmlformats.org/drawingml/2006/picture" xmlns:wp="http://schemas.openxmlformats.org/drawingml/2006/wordprocessingDrawing">
   <w:body>
-    <w:bookmarkStart w:id="34" w:name="Xf1ae7ae721b7591863d78bfdb78c10b9494d189"/>
+    <w:bookmarkStart w:id="30" w:name="X34d9034e722b5e0fa4dc1cdaddb13cbeb82e47e"/>
     <w:p>
       <w:pPr>
         <w:pStyle w:val="Heading1"/>
       </w:pPr>
       <w:r>
-        <w:t xml:space="preserve">John 1:1–1:5: Greek Original Text, Interlinear Translation &amp; the Ontology of the Logos</w:t>
+        <w:t xml:space="preserve">John 1:1–1:5: Greek Original Text &amp; the Ontology of the Logos</w:t>
       </w:r>
     </w:p>
     <w:bookmarkStart w:id="9" w:name="X604b8055522281c6afab2d6013c06344304ff8e"/>
@@ -110,13 +110,13 @@
       </w:r>
     </w:p>
     <w:bookmarkEnd w:id="9"/>
-    <w:bookmarkStart w:id="15" w:name="Xb121d2e4e3c38d4bc18b2718541baf49297f3a0"/>
+    <w:bookmarkStart w:id="14" w:name="X0cdee9c7f8bbb01bce4d7aa628fdf22e7711b59"/>
     <w:p>
       <w:pPr>
         <w:pStyle w:val="Heading2"/>
       </w:pPr>
       <w:r>
-        <w:t xml:space="preserve">1. Verse-by-Verse Greek Original and Interlinear Translation</w:t>
+        <w:t xml:space="preserve">1. Greek Original Text &amp; Verse-by-Verse Translation</w:t>
       </w:r>
     </w:p>
     <w:p>
@@ -172,672 +172,118 @@
         </w:pict>
       </w:r>
     </w:p>
-    <w:bookmarkStart w:id="10" w:name="verse-11"/>
+    <w:bookmarkStart w:id="10" w:name="verse-by-verse-presentation"/>
     <w:p>
       <w:pPr>
         <w:pStyle w:val="Heading3"/>
       </w:pPr>
       <w:r>
+        <w:t xml:space="preserve">Verse-by-Verse Presentation</w:t>
+      </w:r>
+    </w:p>
+    <w:p>
+      <w:pPr>
+        <w:numPr>
+          <w:ilvl w:val="0"/>
+          <w:numId w:val="1001"/>
+        </w:numPr>
+      </w:pPr>
+      <w:r>
+        <w:rPr>
+          <w:b/>
+          <w:bCs/>
+        </w:rPr>
         <w:t xml:space="preserve">Verse 1:1</w:t>
       </w:r>
-    </w:p>
-    <w:p>
-      <w:pPr>
-        <w:pStyle w:val="FirstParagraph"/>
-      </w:pPr>
-      <m:oMathPara>
-        <m:oMathParaPr>
-          <m:jc m:val="center"/>
-        </m:oMathParaPr>
-        <m:oMath>
-          <m:m>
-            <m:mPr>
-              <m:baseJc m:val="center"/>
-              <m:plcHide m:val="on"/>
-              <m:mcs>
-                <m:mc>
-                  <m:mcPr>
-                    <m:mcJc m:val="left"/>
-                    <m:count m:val="1"/>
-                  </m:mcPr>
-                </m:mc>
-                <m:mc>
-                  <m:mcPr>
-                    <m:mcJc m:val="center"/>
-                    <m:count m:val="1"/>
-                  </m:mcPr>
-                </m:mc>
-                <m:mc>
-                  <m:mcPr>
-                    <m:mcJc m:val="center"/>
-                    <m:count m:val="1"/>
-                  </m:mcPr>
-                </m:mc>
-                <m:mc>
-                  <m:mcPr>
-                    <m:mcJc m:val="center"/>
-                    <m:count m:val="1"/>
-                  </m:mcPr>
-                </m:mc>
-                <m:mc>
-                  <m:mcPr>
-                    <m:mcJc m:val="center"/>
-                    <m:count m:val="1"/>
-                  </m:mcPr>
-                </m:mc>
-              </m:mcs>
-            </m:mPr>
-            <m:mr>
-              <m:e>
-                <m:r>
-                  <m:rPr>
-                    <m:nor/>
-                    <m:sty m:val="b"/>
-                  </m:rPr>
-                  <m:t>Ἐν</m:t>
-                </m:r>
-              </m:e>
-              <m:e>
-                <m:r>
-                  <m:rPr>
-                    <m:nor/>
-                    <m:sty m:val="b"/>
-                  </m:rPr>
-                  <m:t>ἀρχῇ</m:t>
-                </m:r>
-              </m:e>
-              <m:e>
-                <m:r>
-                  <m:rPr>
-                    <m:nor/>
-                    <m:sty m:val="b"/>
-                  </m:rPr>
-                  <m:t>ἦν</m:t>
-                </m:r>
-              </m:e>
-              <m:e>
-                <m:r>
-                  <m:rPr>
-                    <m:nor/>
-                    <m:sty m:val="b"/>
-                  </m:rPr>
-                  <m:t>ὁ</m:t>
-                </m:r>
-              </m:e>
-              <m:e>
-                <m:r>
-                  <m:rPr>
-                    <m:nor/>
-                    <m:sty m:val="b"/>
-                  </m:rPr>
-                  <m:t>λόγος,</m:t>
-                </m:r>
-              </m:e>
-            </m:mr>
-            <m:mr>
-              <m:e>
-                <m:r>
-                  <m:rPr>
-                    <m:nor/>
-                    <m:sty m:val="p"/>
-                  </m:rPr>
-                  <m:t>En</m:t>
-                </m:r>
-              </m:e>
-              <m:e>
-                <m:r>
-                  <m:rPr>
-                    <m:nor/>
-                    <m:sty m:val="p"/>
-                  </m:rPr>
-                  <m:t>archē</m:t>
-                </m:r>
-              </m:e>
-              <m:e>
-                <m:r>
-                  <m:rPr>
-                    <m:nor/>
-                    <m:sty m:val="p"/>
-                  </m:rPr>
-                  <m:t>ēn</m:t>
-                </m:r>
-              </m:e>
-              <m:e>
-                <m:r>
-                  <m:rPr>
-                    <m:nor/>
-                    <m:sty m:val="p"/>
-                  </m:rPr>
-                  <m:t>ho</m:t>
-                </m:r>
-              </m:e>
-              <m:e>
-                <m:r>
-                  <m:rPr>
-                    <m:nor/>
-                    <m:sty m:val="p"/>
-                  </m:rPr>
-                  <m:t>logos,</m:t>
-                </m:r>
-              </m:e>
-            </m:mr>
-            <m:mr>
-              <m:e>
-                <m:r>
-                  <m:rPr>
-                    <m:nor/>
-                    <m:sty m:val="p"/>
-                  </m:rPr>
-                  <m:t>[In]</m:t>
-                </m:r>
-              </m:e>
-              <m:e>
-                <m:r>
-                  <m:rPr>
-                    <m:nor/>
-                    <m:sty m:val="p"/>
-                  </m:rPr>
-                  <m:t>[origin/principle]</m:t>
-                </m:r>
-              </m:e>
-              <m:e>
-                <m:r>
-                  <m:rPr>
-                    <m:nor/>
-                    <m:sty m:val="p"/>
-                  </m:rPr>
-                  <m:t>[was]</m:t>
-                </m:r>
-              </m:e>
-              <m:e>
-                <m:r>
-                  <m:rPr>
-                    <m:nor/>
-                    <m:sty m:val="p"/>
-                  </m:rPr>
-                  <m:t>[the]</m:t>
-                </m:r>
-              </m:e>
-              <m:e>
-                <m:r>
-                  <m:rPr>
-                    <m:nor/>
-                    <m:sty m:val="b"/>
-                  </m:rPr>
-                  <m:t>[Logos],</m:t>
-                </m:r>
-              </m:e>
-            </m:mr>
-          </m:m>
-        </m:oMath>
-      </m:oMathPara>
-    </w:p>
-    <w:p>
-      <w:pPr>
-        <w:pStyle w:val="FirstParagraph"/>
-      </w:pPr>
-      <m:oMathPara>
-        <m:oMathParaPr>
-          <m:jc m:val="center"/>
-        </m:oMathParaPr>
-        <m:oMath>
-          <m:m>
-            <m:mPr>
-              <m:baseJc m:val="center"/>
-              <m:plcHide m:val="on"/>
-              <m:mcs>
-                <m:mc>
-                  <m:mcPr>
-                    <m:mcJc m:val="left"/>
-                    <m:count m:val="1"/>
-                  </m:mcPr>
-                </m:mc>
-                <m:mc>
-                  <m:mcPr>
-                    <m:mcJc m:val="center"/>
-                    <m:count m:val="1"/>
-                  </m:mcPr>
-                </m:mc>
-                <m:mc>
-                  <m:mcPr>
-                    <m:mcJc m:val="center"/>
-                    <m:count m:val="1"/>
-                  </m:mcPr>
-                </m:mc>
-                <m:mc>
-                  <m:mcPr>
-                    <m:mcJc m:val="center"/>
-                    <m:count m:val="1"/>
-                  </m:mcPr>
-                </m:mc>
-                <m:mc>
-                  <m:mcPr>
-                    <m:mcJc m:val="center"/>
-                    <m:count m:val="1"/>
-                  </m:mcPr>
-                </m:mc>
-                <m:mc>
-                  <m:mcPr>
-                    <m:mcJc m:val="center"/>
-                    <m:count m:val="1"/>
-                  </m:mcPr>
-                </m:mc>
-                <m:mc>
-                  <m:mcPr>
-                    <m:mcJc m:val="center"/>
-                    <m:count m:val="1"/>
-                  </m:mcPr>
-                </m:mc>
-              </m:mcs>
-            </m:mPr>
-            <m:mr>
-              <m:e>
-                <m:r>
-                  <m:rPr>
-                    <m:nor/>
-                    <m:sty m:val="b"/>
-                  </m:rPr>
-                  <m:t>καὶ</m:t>
-                </m:r>
-              </m:e>
-              <m:e>
-                <m:r>
-                  <m:rPr>
-                    <m:nor/>
-                    <m:sty m:val="b"/>
-                  </m:rPr>
-                  <m:t>ὁ</m:t>
-                </m:r>
-              </m:e>
-              <m:e>
-                <m:r>
-                  <m:rPr>
-                    <m:nor/>
-                    <m:sty m:val="b"/>
-                  </m:rPr>
-                  <m:t>λόγος</m:t>
-                </m:r>
-              </m:e>
-              <m:e>
-                <m:r>
-                  <m:rPr>
-                    <m:nor/>
-                    <m:sty m:val="b"/>
-                  </m:rPr>
-                  <m:t>ἦν</m:t>
-                </m:r>
-              </m:e>
-              <m:e>
-                <m:r>
-                  <m:rPr>
-                    <m:nor/>
-                    <m:sty m:val="b"/>
-                  </m:rPr>
-                  <m:t>πρὸς</m:t>
-                </m:r>
-              </m:e>
-              <m:e>
-                <m:r>
-                  <m:rPr>
-                    <m:nor/>
-                    <m:sty m:val="b"/>
-                  </m:rPr>
-                  <m:t>τὸν</m:t>
-                </m:r>
-              </m:e>
-              <m:e>
-                <m:r>
-                  <m:rPr>
-                    <m:nor/>
-                    <m:sty m:val="b"/>
-                  </m:rPr>
-                  <m:t>θεόν,</m:t>
-                </m:r>
-              </m:e>
-            </m:mr>
-            <m:mr>
-              <m:e>
-                <m:r>
-                  <m:rPr>
-                    <m:nor/>
-                    <m:sty m:val="p"/>
-                  </m:rPr>
-                  <m:t>kai</m:t>
-                </m:r>
-              </m:e>
-              <m:e>
-                <m:r>
-                  <m:rPr>
-                    <m:nor/>
-                    <m:sty m:val="p"/>
-                  </m:rPr>
-                  <m:t>ho</m:t>
-                </m:r>
-              </m:e>
-              <m:e>
-                <m:r>
-                  <m:rPr>
-                    <m:nor/>
-                    <m:sty m:val="p"/>
-                  </m:rPr>
-                  <m:t>logos</m:t>
-                </m:r>
-              </m:e>
-              <m:e>
-                <m:r>
-                  <m:rPr>
-                    <m:nor/>
-                    <m:sty m:val="p"/>
-                  </m:rPr>
-                  <m:t>ēn</m:t>
-                </m:r>
-              </m:e>
-              <m:e>
-                <m:r>
-                  <m:rPr>
-                    <m:nor/>
-                    <m:sty m:val="p"/>
-                  </m:rPr>
-                  <m:t>pros</m:t>
-                </m:r>
-              </m:e>
-              <m:e>
-                <m:r>
-                  <m:rPr>
-                    <m:nor/>
-                    <m:sty m:val="p"/>
-                  </m:rPr>
-                  <m:t>ton</m:t>
-                </m:r>
-              </m:e>
-              <m:e>
-                <m:r>
-                  <m:rPr>
-                    <m:nor/>
-                    <m:sty m:val="p"/>
-                  </m:rPr>
-                  <m:t>theon,</m:t>
-                </m:r>
-              </m:e>
-            </m:mr>
-            <m:mr>
-              <m:e>
-                <m:r>
-                  <m:rPr>
-                    <m:nor/>
-                    <m:sty m:val="p"/>
-                  </m:rPr>
-                  <m:t>[and]</m:t>
-                </m:r>
-              </m:e>
-              <m:e>
-                <m:r>
-                  <m:rPr>
-                    <m:nor/>
-                    <m:sty m:val="p"/>
-                  </m:rPr>
-                  <m:t>[the]</m:t>
-                </m:r>
-              </m:e>
-              <m:e>
-                <m:r>
-                  <m:rPr>
-                    <m:nor/>
-                    <m:sty m:val="b"/>
-                  </m:rPr>
-                  <m:t>[Logos]</m:t>
-                </m:r>
-              </m:e>
-              <m:e>
-                <m:r>
-                  <m:rPr>
-                    <m:nor/>
-                    <m:sty m:val="p"/>
-                  </m:rPr>
-                  <m:t>[was]</m:t>
-                </m:r>
-              </m:e>
-              <m:e>
-                <m:r>
-                  <m:rPr>
-                    <m:nor/>
-                    <m:sty m:val="p"/>
-                  </m:rPr>
-                  <m:t>[in intimate relation with]</m:t>
-                </m:r>
-              </m:e>
-              <m:e>
-                <m:r>
-                  <m:rPr>
-                    <m:nor/>
-                    <m:sty m:val="p"/>
-                  </m:rPr>
-                  <m:t>[the]</m:t>
-                </m:r>
-              </m:e>
-              <m:e>
-                <m:r>
-                  <m:rPr>
-                    <m:nor/>
-                    <m:sty m:val="p"/>
-                  </m:rPr>
-                  <m:t>[God],</m:t>
-                </m:r>
-              </m:e>
-            </m:mr>
-          </m:m>
-        </m:oMath>
-      </m:oMathPara>
-    </w:p>
-    <w:p>
-      <w:pPr>
-        <w:pStyle w:val="FirstParagraph"/>
-      </w:pPr>
-      <m:oMathPara>
-        <m:oMathParaPr>
-          <m:jc m:val="center"/>
-        </m:oMathParaPr>
-        <m:oMath>
-          <m:m>
-            <m:mPr>
-              <m:baseJc m:val="center"/>
-              <m:plcHide m:val="on"/>
-              <m:mcs>
-                <m:mc>
-                  <m:mcPr>
-                    <m:mcJc m:val="left"/>
-                    <m:count m:val="1"/>
-                  </m:mcPr>
-                </m:mc>
-                <m:mc>
-                  <m:mcPr>
-                    <m:mcJc m:val="center"/>
-                    <m:count m:val="1"/>
-                  </m:mcPr>
-                </m:mc>
-                <m:mc>
-                  <m:mcPr>
-                    <m:mcJc m:val="center"/>
-                    <m:count m:val="1"/>
-                  </m:mcPr>
-                </m:mc>
-                <m:mc>
-                  <m:mcPr>
-                    <m:mcJc m:val="center"/>
-                    <m:count m:val="1"/>
-                  </m:mcPr>
-                </m:mc>
-                <m:mc>
-                  <m:mcPr>
-                    <m:mcJc m:val="center"/>
-                    <m:count m:val="1"/>
-                  </m:mcPr>
-                </m:mc>
-              </m:mcs>
-            </m:mPr>
-            <m:mr>
-              <m:e>
-                <m:r>
-                  <m:rPr>
-                    <m:nor/>
-                    <m:sty m:val="b"/>
-                  </m:rPr>
-                  <m:t>καὶ</m:t>
-                </m:r>
-              </m:e>
-              <m:e>
-                <m:r>
-                  <m:rPr>
-                    <m:nor/>
-                    <m:sty m:val="b"/>
-                  </m:rPr>
-                  <m:t>θεὸς</m:t>
-                </m:r>
-              </m:e>
-              <m:e>
-                <m:r>
-                  <m:rPr>
-                    <m:nor/>
-                    <m:sty m:val="b"/>
-                  </m:rPr>
-                  <m:t>ἦν</m:t>
-                </m:r>
-              </m:e>
-              <m:e>
-                <m:r>
-                  <m:rPr>
-                    <m:nor/>
-                    <m:sty m:val="b"/>
-                  </m:rPr>
-                  <m:t>ὁ</m:t>
-                </m:r>
-              </m:e>
-              <m:e>
-                <m:r>
-                  <m:rPr>
-                    <m:nor/>
-                    <m:sty m:val="b"/>
-                  </m:rPr>
-                  <m:t>λόγος.</m:t>
-                </m:r>
-              </m:e>
-            </m:mr>
-            <m:mr>
-              <m:e>
-                <m:r>
-                  <m:rPr>
-                    <m:nor/>
-                    <m:sty m:val="p"/>
-                  </m:rPr>
-                  <m:t>kai</m:t>
-                </m:r>
-              </m:e>
-              <m:e>
-                <m:r>
-                  <m:rPr>
-                    <m:nor/>
-                    <m:sty m:val="p"/>
-                  </m:rPr>
-                  <m:t>theos</m:t>
-                </m:r>
-              </m:e>
-              <m:e>
-                <m:r>
-                  <m:rPr>
-                    <m:nor/>
-                    <m:sty m:val="p"/>
-                  </m:rPr>
-                  <m:t>ēn</m:t>
-                </m:r>
-              </m:e>
-              <m:e>
-                <m:r>
-                  <m:rPr>
-                    <m:nor/>
-                    <m:sty m:val="p"/>
-                  </m:rPr>
-                  <m:t>ho</m:t>
-                </m:r>
-              </m:e>
-              <m:e>
-                <m:r>
-                  <m:rPr>
-                    <m:nor/>
-                    <m:sty m:val="p"/>
-                  </m:rPr>
-                  <m:t>logos.</m:t>
-                </m:r>
-              </m:e>
-            </m:mr>
-            <m:mr>
-              <m:e>
-                <m:r>
-                  <m:rPr>
-                    <m:nor/>
-                    <m:sty m:val="p"/>
-                  </m:rPr>
-                  <m:t>[and]</m:t>
-                </m:r>
-              </m:e>
-              <m:e>
-                <m:r>
-                  <m:rPr>
-                    <m:nor/>
-                    <m:sty m:val="p"/>
-                  </m:rPr>
-                  <m:t>[divine in nature]</m:t>
-                </m:r>
-              </m:e>
-              <m:e>
-                <m:r>
-                  <m:rPr>
-                    <m:nor/>
-                    <m:sty m:val="p"/>
-                  </m:rPr>
-                  <m:t>[was]</m:t>
-                </m:r>
-              </m:e>
-              <m:e>
-                <m:r>
-                  <m:rPr>
-                    <m:nor/>
-                    <m:sty m:val="p"/>
-                  </m:rPr>
-                  <m:t>[the]</m:t>
-                </m:r>
-              </m:e>
-              <m:e>
-                <m:r>
-                  <m:rPr>
-                    <m:nor/>
-                    <m:sty m:val="b"/>
-                  </m:rPr>
-                  <m:t>[Logos].</m:t>
-                </m:r>
-              </m:e>
-            </m:mr>
-          </m:m>
-        </m:oMath>
-      </m:oMathPara>
-    </w:p>
-    <w:p>
-      <w:pPr>
-        <w:pStyle w:val="BlockText"/>
-      </w:pPr>
-      <w:r>
-        <w:rPr>
-          <w:b/>
-          <w:bCs/>
-        </w:rPr>
-        <w:t xml:space="preserve">Syntactic Note:</w:t>
-      </w:r>
-      <w:r>
-        <w:t xml:space="preserve"> </w:t>
-      </w:r>
-      <w:r>
-        <w:t xml:space="preserve">In the third clause,</w:t>
-      </w:r>
-      <w:r>
+      <w:r>
+        <w:br/>
+      </w:r>
+      <w:r>
+        <w:rPr>
+          <w:b/>
+          <w:bCs/>
+        </w:rPr>
+        <w:t xml:space="preserve">Greek (Nestle-Aland 28):</w:t>
+      </w:r>
+      <w:r>
+        <w:br/>
+      </w:r>
+      <w:r>
+        <w:t xml:space="preserve">Ἐν ἀρχῇ ἦν ὁ λόγος, καὶ ὁ λόγος ἦν πρὸς τὸν θεόν, καὶ θεὸς ἦν ὁ λόγος.</w:t>
+      </w:r>
+      <w:r>
+        <w:br/>
+      </w:r>
+      <w:r>
+        <w:rPr>
+          <w:b/>
+          <w:bCs/>
+        </w:rPr>
+        <w:t xml:space="preserve">English Translation:</w:t>
+      </w:r>
+      <w:r>
+        <w:br/>
+      </w:r>
+      <w:r>
+        <w:t xml:space="preserve">In the beginning [in the foundational origin] was the</w:t>
+      </w:r>
+      <w:r>
+        <w:t xml:space="preserve"> </w:t>
+      </w:r>
+      <w:r>
+        <w:rPr>
+          <w:b/>
+          <w:bCs/>
+        </w:rPr>
+        <w:t xml:space="preserve">Logos</w:t>
+      </w:r>
+      <w:r>
+        <w:t xml:space="preserve">, and the</w:t>
+      </w:r>
+      <w:r>
+        <w:t xml:space="preserve"> </w:t>
+      </w:r>
+      <w:r>
+        <w:rPr>
+          <w:b/>
+          <w:bCs/>
+        </w:rPr>
+        <w:t xml:space="preserve">Logos</w:t>
+      </w:r>
+      <w:r>
+        <w:t xml:space="preserve"> </w:t>
+      </w:r>
+      <w:r>
+        <w:t xml:space="preserve">was in dynamic relation with God, and divine in essence was the</w:t>
+      </w:r>
+      <w:r>
+        <w:t xml:space="preserve"> </w:t>
+      </w:r>
+      <w:r>
+        <w:rPr>
+          <w:b/>
+          <w:bCs/>
+        </w:rPr>
+        <w:t xml:space="preserve">Logos</w:t>
+      </w:r>
+      <w:r>
+        <w:t xml:space="preserve">.</w:t>
+      </w:r>
+      <w:r>
+        <w:br/>
+      </w:r>
+      <w:r>
+        <w:rPr>
+          <w:i/>
+          <w:iCs/>
+        </w:rPr>
+        <w:t xml:space="preserve">(Syntactic Note: In the third clause,</w:t>
+      </w:r>
+      <w:r>
+        <w:rPr>
+          <w:i/>
+          <w:iCs/>
+        </w:rPr>
         <w:t xml:space="preserve"> </w:t>
       </w:r>
       <m:oMath>
@@ -862,12 +308,24 @@
         </m:r>
       </m:oMath>
       <w:r>
-        <w:t xml:space="preserve"> </w:t>
-      </w:r>
-      <w:r>
+        <w:rPr>
+          <w:i/>
+          <w:iCs/>
+        </w:rPr>
+        <w:t xml:space="preserve"> </w:t>
+      </w:r>
+      <w:r>
+        <w:rPr>
+          <w:i/>
+          <w:iCs/>
+        </w:rPr>
         <w:t xml:space="preserve">stands without the definite article before the verb</w:t>
       </w:r>
       <w:r>
+        <w:rPr>
+          <w:i/>
+          <w:iCs/>
+        </w:rPr>
         <w:t xml:space="preserve"> </w:t>
       </w:r>
       <m:oMath>
@@ -886,7 +344,199 @@
         </m:r>
       </m:oMath>
       <w:r>
-        <w:t xml:space="preserve">, functioning as a qualitative predicate: The Logos is divine in essence and nature, identical with ultimate reality.</w:t>
+        <w:rPr>
+          <w:i/>
+          <w:iCs/>
+        </w:rPr>
+        <w:t xml:space="preserve">, functioning as a qualitative predicate: The Logos is divine in essence and nature, identical with ultimate reality.)</w:t>
+      </w:r>
+    </w:p>
+    <w:p>
+      <w:pPr>
+        <w:numPr>
+          <w:ilvl w:val="0"/>
+          <w:numId w:val="1001"/>
+        </w:numPr>
+      </w:pPr>
+      <w:r>
+        <w:rPr>
+          <w:b/>
+          <w:bCs/>
+        </w:rPr>
+        <w:t xml:space="preserve">Verse 1:2</w:t>
+      </w:r>
+      <w:r>
+        <w:br/>
+      </w:r>
+      <w:r>
+        <w:rPr>
+          <w:b/>
+          <w:bCs/>
+        </w:rPr>
+        <w:t xml:space="preserve">Greek (Nestle-Aland 28):</w:t>
+      </w:r>
+      <w:r>
+        <w:br/>
+      </w:r>
+      <w:r>
+        <w:t xml:space="preserve">οὗτος ἦν ἐν ἀρχῇ πρὸς τὸν θεόν.</w:t>
+      </w:r>
+      <w:r>
+        <w:br/>
+      </w:r>
+      <w:r>
+        <w:rPr>
+          <w:b/>
+          <w:bCs/>
+        </w:rPr>
+        <w:t xml:space="preserve">English Translation:</w:t>
+      </w:r>
+      <w:r>
+        <w:br/>
+      </w:r>
+      <w:r>
+        <w:t xml:space="preserve">This very one was in the beginning in dynamic relation with God.</w:t>
+      </w:r>
+    </w:p>
+    <w:p>
+      <w:pPr>
+        <w:numPr>
+          <w:ilvl w:val="0"/>
+          <w:numId w:val="1001"/>
+        </w:numPr>
+      </w:pPr>
+      <w:r>
+        <w:rPr>
+          <w:b/>
+          <w:bCs/>
+        </w:rPr>
+        <w:t xml:space="preserve">Verse 1:3</w:t>
+      </w:r>
+      <w:r>
+        <w:br/>
+      </w:r>
+      <w:r>
+        <w:rPr>
+          <w:b/>
+          <w:bCs/>
+        </w:rPr>
+        <w:t xml:space="preserve">Greek (Nestle-Aland 28):</w:t>
+      </w:r>
+      <w:r>
+        <w:br/>
+      </w:r>
+      <w:r>
+        <w:t xml:space="preserve">πάντα δι’ αὐτοῦ ἐγένετο, καὶ χωρὶς αὐτοῦ ἐγένετο οὐδὲ ἕν ὃ γέγονεν.</w:t>
+      </w:r>
+      <w:r>
+        <w:br/>
+      </w:r>
+      <w:r>
+        <w:rPr>
+          <w:b/>
+          <w:bCs/>
+        </w:rPr>
+        <w:t xml:space="preserve">English Translation:</w:t>
+      </w:r>
+      <w:r>
+        <w:br/>
+      </w:r>
+      <w:r>
+        <w:t xml:space="preserve">All things came into being through it, and apart from it not a single thing came into being that has come to be.</w:t>
+      </w:r>
+    </w:p>
+    <w:p>
+      <w:pPr>
+        <w:numPr>
+          <w:ilvl w:val="0"/>
+          <w:numId w:val="1001"/>
+        </w:numPr>
+      </w:pPr>
+      <w:r>
+        <w:rPr>
+          <w:b/>
+          <w:bCs/>
+        </w:rPr>
+        <w:t xml:space="preserve">Verse 1:4</w:t>
+      </w:r>
+      <w:r>
+        <w:br/>
+      </w:r>
+      <w:r>
+        <w:rPr>
+          <w:b/>
+          <w:bCs/>
+        </w:rPr>
+        <w:t xml:space="preserve">Greek (Nestle-Aland 28):</w:t>
+      </w:r>
+      <w:r>
+        <w:br/>
+      </w:r>
+      <w:r>
+        <w:t xml:space="preserve">ἐν αὐτῷ ζωὴ ἦν, καὶ ἡ ζωὴ ἦν τὸ φῶς τῶν ἀνθρώπων·</w:t>
+      </w:r>
+      <w:r>
+        <w:br/>
+      </w:r>
+      <w:r>
+        <w:rPr>
+          <w:b/>
+          <w:bCs/>
+        </w:rPr>
+        <w:t xml:space="preserve">English Translation:</w:t>
+      </w:r>
+      <w:r>
+        <w:br/>
+      </w:r>
+      <w:r>
+        <w:t xml:space="preserve">In it was Life, and the Life was the Light of humanity.</w:t>
+      </w:r>
+    </w:p>
+    <w:p>
+      <w:pPr>
+        <w:numPr>
+          <w:ilvl w:val="0"/>
+          <w:numId w:val="1001"/>
+        </w:numPr>
+      </w:pPr>
+      <w:r>
+        <w:rPr>
+          <w:b/>
+          <w:bCs/>
+        </w:rPr>
+        <w:t xml:space="preserve">Verse 1:5</w:t>
+      </w:r>
+      <w:r>
+        <w:br/>
+      </w:r>
+      <w:r>
+        <w:rPr>
+          <w:b/>
+          <w:bCs/>
+        </w:rPr>
+        <w:t xml:space="preserve">Greek (Nestle-Aland 28):</w:t>
+      </w:r>
+      <w:r>
+        <w:br/>
+      </w:r>
+      <w:r>
+        <w:t xml:space="preserve">καὶ τὸ φῶς ἐν τῇ σκοτίᾳ φαίνει, καὶ ἡ σκοτία αὐτὸ οὐ κατέλαβεν.</w:t>
+      </w:r>
+      <w:r>
+        <w:br/>
+      </w:r>
+      <w:r>
+        <w:rPr>
+          <w:b/>
+          <w:bCs/>
+        </w:rPr>
+        <w:t xml:space="preserve">English Translation:</w:t>
+      </w:r>
+      <w:r>
+        <w:br/>
+      </w:r>
+      <w:r>
+        <w:t xml:space="preserve">And the Light shines in the darkness, and the darkness did not overcome it.</w:t>
       </w:r>
     </w:p>
     <w:p>
@@ -897,271 +547,189 @@
       </w:r>
     </w:p>
     <w:bookmarkEnd w:id="10"/>
-    <w:bookmarkStart w:id="11" w:name="verse-12"/>
+    <w:bookmarkStart w:id="13" w:name="continuous-reading-text"/>
     <w:p>
       <w:pPr>
         <w:pStyle w:val="Heading3"/>
       </w:pPr>
       <w:r>
-        <w:t xml:space="preserve">Verse 1:2</w:t>
-      </w:r>
-    </w:p>
-    <w:p>
-      <w:pPr>
-        <w:pStyle w:val="FirstParagraph"/>
-      </w:pPr>
-      <m:oMathPara>
-        <m:oMathParaPr>
-          <m:jc m:val="center"/>
-        </m:oMathParaPr>
-        <m:oMath>
-          <m:m>
-            <m:mPr>
-              <m:baseJc m:val="center"/>
-              <m:plcHide m:val="on"/>
-              <m:mcs>
-                <m:mc>
-                  <m:mcPr>
-                    <m:mcJc m:val="left"/>
-                    <m:count m:val="1"/>
-                  </m:mcPr>
-                </m:mc>
-                <m:mc>
-                  <m:mcPr>
-                    <m:mcJc m:val="center"/>
-                    <m:count m:val="1"/>
-                  </m:mcPr>
-                </m:mc>
-                <m:mc>
-                  <m:mcPr>
-                    <m:mcJc m:val="center"/>
-                    <m:count m:val="1"/>
-                  </m:mcPr>
-                </m:mc>
-                <m:mc>
-                  <m:mcPr>
-                    <m:mcJc m:val="center"/>
-                    <m:count m:val="1"/>
-                  </m:mcPr>
-                </m:mc>
-                <m:mc>
-                  <m:mcPr>
-                    <m:mcJc m:val="center"/>
-                    <m:count m:val="1"/>
-                  </m:mcPr>
-                </m:mc>
-                <m:mc>
-                  <m:mcPr>
-                    <m:mcJc m:val="center"/>
-                    <m:count m:val="1"/>
-                  </m:mcPr>
-                </m:mc>
-                <m:mc>
-                  <m:mcPr>
-                    <m:mcJc m:val="center"/>
-                    <m:count m:val="1"/>
-                  </m:mcPr>
-                </m:mc>
-              </m:mcs>
-            </m:mPr>
-            <m:mr>
-              <m:e>
-                <m:r>
-                  <m:rPr>
-                    <m:nor/>
-                    <m:sty m:val="b"/>
-                  </m:rPr>
-                  <m:t>οὗτος</m:t>
-                </m:r>
-              </m:e>
-              <m:e>
-                <m:r>
-                  <m:rPr>
-                    <m:nor/>
-                    <m:sty m:val="b"/>
-                  </m:rPr>
-                  <m:t>ἦν</m:t>
-                </m:r>
-              </m:e>
-              <m:e>
-                <m:r>
-                  <m:rPr>
-                    <m:nor/>
-                    <m:sty m:val="b"/>
-                  </m:rPr>
-                  <m:t>ἐν</m:t>
-                </m:r>
-              </m:e>
-              <m:e>
-                <m:r>
-                  <m:rPr>
-                    <m:nor/>
-                    <m:sty m:val="b"/>
-                  </m:rPr>
-                  <m:t>ἀρχῇ</m:t>
-                </m:r>
-              </m:e>
-              <m:e>
-                <m:r>
-                  <m:rPr>
-                    <m:nor/>
-                    <m:sty m:val="b"/>
-                  </m:rPr>
-                  <m:t>πρὸς</m:t>
-                </m:r>
-              </m:e>
-              <m:e>
-                <m:r>
-                  <m:rPr>
-                    <m:nor/>
-                    <m:sty m:val="b"/>
-                  </m:rPr>
-                  <m:t>τὸν</m:t>
-                </m:r>
-              </m:e>
-              <m:e>
-                <m:r>
-                  <m:rPr>
-                    <m:nor/>
-                    <m:sty m:val="b"/>
-                  </m:rPr>
-                  <m:t>θεόν.</m:t>
-                </m:r>
-              </m:e>
-            </m:mr>
-            <m:mr>
-              <m:e>
-                <m:r>
-                  <m:rPr>
-                    <m:nor/>
-                    <m:sty m:val="p"/>
-                  </m:rPr>
-                  <m:t>Houtos</m:t>
-                </m:r>
-              </m:e>
-              <m:e>
-                <m:r>
-                  <m:rPr>
-                    <m:nor/>
-                    <m:sty m:val="p"/>
-                  </m:rPr>
-                  <m:t>ēn</m:t>
-                </m:r>
-              </m:e>
-              <m:e>
-                <m:r>
-                  <m:rPr>
-                    <m:nor/>
-                    <m:sty m:val="p"/>
-                  </m:rPr>
-                  <m:t>en</m:t>
-                </m:r>
-              </m:e>
-              <m:e>
-                <m:r>
-                  <m:rPr>
-                    <m:nor/>
-                    <m:sty m:val="p"/>
-                  </m:rPr>
-                  <m:t>archē</m:t>
-                </m:r>
-              </m:e>
-              <m:e>
-                <m:r>
-                  <m:rPr>
-                    <m:nor/>
-                    <m:sty m:val="p"/>
-                  </m:rPr>
-                  <m:t>pros</m:t>
-                </m:r>
-              </m:e>
-              <m:e>
-                <m:r>
-                  <m:rPr>
-                    <m:nor/>
-                    <m:sty m:val="p"/>
-                  </m:rPr>
-                  <m:t>ton</m:t>
-                </m:r>
-              </m:e>
-              <m:e>
-                <m:r>
-                  <m:rPr>
-                    <m:nor/>
-                    <m:sty m:val="p"/>
-                  </m:rPr>
-                  <m:t>theon.</m:t>
-                </m:r>
-              </m:e>
-            </m:mr>
-            <m:mr>
-              <m:e>
-                <m:r>
-                  <m:rPr>
-                    <m:nor/>
-                    <m:sty m:val="p"/>
-                  </m:rPr>
-                  <m:t>[This one]</m:t>
-                </m:r>
-              </m:e>
-              <m:e>
-                <m:r>
-                  <m:rPr>
-                    <m:nor/>
-                    <m:sty m:val="p"/>
-                  </m:rPr>
-                  <m:t>[was]</m:t>
-                </m:r>
-              </m:e>
-              <m:e>
-                <m:r>
-                  <m:rPr>
-                    <m:nor/>
-                    <m:sty m:val="p"/>
-                  </m:rPr>
-                  <m:t>[in]</m:t>
-                </m:r>
-              </m:e>
-              <m:e>
-                <m:r>
-                  <m:rPr>
-                    <m:nor/>
-                    <m:sty m:val="p"/>
-                  </m:rPr>
-                  <m:t>[origin/principle]</m:t>
-                </m:r>
-              </m:e>
-              <m:e>
-                <m:r>
-                  <m:rPr>
-                    <m:nor/>
-                    <m:sty m:val="p"/>
-                  </m:rPr>
-                  <m:t>[in relation with]</m:t>
-                </m:r>
-              </m:e>
-              <m:e>
-                <m:r>
-                  <m:rPr>
-                    <m:nor/>
-                    <m:sty m:val="p"/>
-                  </m:rPr>
-                  <m:t>[the]</m:t>
-                </m:r>
-              </m:e>
-              <m:e>
-                <m:r>
-                  <m:rPr>
-                    <m:nor/>
-                    <m:sty m:val="p"/>
-                  </m:rPr>
-                  <m:t>[God].</m:t>
-                </m:r>
-              </m:e>
-            </m:mr>
-          </m:m>
-        </m:oMath>
-      </m:oMathPara>
+        <w:t xml:space="preserve">Continuous Reading Text</w:t>
+      </w:r>
+    </w:p>
+    <w:bookmarkStart w:id="11" w:name="greek-original-nestle-aland-28"/>
+    <w:p>
+      <w:pPr>
+        <w:pStyle w:val="Heading4"/>
+      </w:pPr>
+      <w:r>
+        <w:t xml:space="preserve">Greek Original (Nestle-Aland 28)</w:t>
+      </w:r>
+    </w:p>
+    <w:p>
+      <w:pPr>
+        <w:pStyle w:val="BlockText"/>
+      </w:pPr>
+      <w:r>
+        <w:t xml:space="preserve">1:1 Ἐν ἀρχῇ ἦν ὁ λόγος, καὶ ὁ λόγος ἦν πρὸς τὸν θεόν, καὶ θεὸς ἦν ὁ λόγος.</w:t>
+      </w:r>
+      <w:r>
+        <w:br/>
+      </w:r>
+      <w:r>
+        <w:t xml:space="preserve">1:2 οὗτος ἦν ἐν ἀρχῇ πρὸς τὸν θεόν.</w:t>
+      </w:r>
+      <w:r>
+        <w:br/>
+      </w:r>
+      <w:r>
+        <w:t xml:space="preserve">1:3 πάντα δι’ αὐτοῦ ἐγένετο, καὶ χωρὶς αὐτοῦ ἐγένετο οὐδὲ ἕν ὃ γέγονεν.</w:t>
+      </w:r>
+      <w:r>
+        <w:br/>
+      </w:r>
+      <w:r>
+        <w:t xml:space="preserve">1:4 ἐν αὐτῷ ζωὴ ἦν, καὶ ἡ ζωὴ ἦν τὸ φῶς τῶν ἀνθρώπων·</w:t>
+      </w:r>
+      <w:r>
+        <w:br/>
+      </w:r>
+      <w:r>
+        <w:t xml:space="preserve">1:5 καὶ τὸ φῶς ἐν τῇ σκοτίᾳ φαίνει, καὶ ἡ σκοτία αὐτὸ οὐ κατέλαβεν.</w:t>
+      </w:r>
+    </w:p>
+    <w:bookmarkEnd w:id="11"/>
+    <w:bookmarkStart w:id="12" w:name="X1a2c122431620246947530a2e5d8c5c9e09a9db"/>
+    <w:p>
+      <w:pPr>
+        <w:pStyle w:val="Heading4"/>
+      </w:pPr>
+      <w:r>
+        <w:t xml:space="preserve">Continuous English Translation (Preserving the Logos)</w:t>
+      </w:r>
+    </w:p>
+    <w:p>
+      <w:pPr>
+        <w:pStyle w:val="BlockText"/>
+      </w:pPr>
+      <w:r>
+        <w:rPr>
+          <w:b/>
+          <w:bCs/>
+        </w:rPr>
+        <w:t xml:space="preserve">1:1</w:t>
+      </w:r>
+      <w:r>
+        <w:t xml:space="preserve"> </w:t>
+      </w:r>
+      <w:r>
+        <w:t xml:space="preserve">In the beginning was the</w:t>
+      </w:r>
+      <w:r>
+        <w:t xml:space="preserve"> </w:t>
+      </w:r>
+      <w:r>
+        <w:rPr>
+          <w:b/>
+          <w:bCs/>
+        </w:rPr>
+        <w:t xml:space="preserve">Logos</w:t>
+      </w:r>
+      <w:r>
+        <w:t xml:space="preserve">, and the</w:t>
+      </w:r>
+      <w:r>
+        <w:t xml:space="preserve"> </w:t>
+      </w:r>
+      <w:r>
+        <w:rPr>
+          <w:b/>
+          <w:bCs/>
+        </w:rPr>
+        <w:t xml:space="preserve">Logos</w:t>
+      </w:r>
+      <w:r>
+        <w:t xml:space="preserve"> </w:t>
+      </w:r>
+      <w:r>
+        <w:t xml:space="preserve">was in dynamic relation with God, and divine in essence was the</w:t>
+      </w:r>
+      <w:r>
+        <w:t xml:space="preserve"> </w:t>
+      </w:r>
+      <w:r>
+        <w:rPr>
+          <w:b/>
+          <w:bCs/>
+        </w:rPr>
+        <w:t xml:space="preserve">Logos</w:t>
+      </w:r>
+      <w:r>
+        <w:t xml:space="preserve">.</w:t>
+      </w:r>
+      <w:r>
+        <w:t xml:space="preserve"> </w:t>
+      </w:r>
+      <w:r>
+        <w:rPr>
+          <w:b/>
+          <w:bCs/>
+        </w:rPr>
+        <w:t xml:space="preserve">1:2</w:t>
+      </w:r>
+      <w:r>
+        <w:t xml:space="preserve"> </w:t>
+      </w:r>
+      <w:r>
+        <w:t xml:space="preserve">This very one was in the beginning in dynamic relation with God.</w:t>
+      </w:r>
+      <w:r>
+        <w:t xml:space="preserve"> </w:t>
+      </w:r>
+      <w:r>
+        <w:rPr>
+          <w:b/>
+          <w:bCs/>
+        </w:rPr>
+        <w:t xml:space="preserve">1:3</w:t>
+      </w:r>
+      <w:r>
+        <w:t xml:space="preserve"> </w:t>
+      </w:r>
+      <w:r>
+        <w:t xml:space="preserve">All things came into being through it, and apart from it not a single thing came into being that has come to be.</w:t>
+      </w:r>
+      <w:r>
+        <w:t xml:space="preserve"> </w:t>
+      </w:r>
+      <w:r>
+        <w:rPr>
+          <w:b/>
+          <w:bCs/>
+        </w:rPr>
+        <w:t xml:space="preserve">1:4</w:t>
+      </w:r>
+      <w:r>
+        <w:t xml:space="preserve"> </w:t>
+      </w:r>
+      <w:r>
+        <w:t xml:space="preserve">In it was Life, and the Life was the Light of humanity.</w:t>
+      </w:r>
+      <w:r>
+        <w:t xml:space="preserve"> </w:t>
+      </w:r>
+      <w:r>
+        <w:rPr>
+          <w:b/>
+          <w:bCs/>
+        </w:rPr>
+        <w:t xml:space="preserve">1:5</w:t>
+      </w:r>
+      <w:r>
+        <w:t xml:space="preserve"> </w:t>
+      </w:r>
+      <w:r>
+        <w:t xml:space="preserve">And the Light shines in the darkness, and the darkness did not overcome it.</w:t>
+      </w:r>
     </w:p>
     <w:p>
       <w:r>
@@ -1170,1636 +738,16 @@
         </w:pict>
       </w:r>
     </w:p>
-    <w:bookmarkEnd w:id="11"/>
-    <w:bookmarkStart w:id="12" w:name="verse-13"/>
-    <w:p>
-      <w:pPr>
-        <w:pStyle w:val="Heading3"/>
-      </w:pPr>
-      <w:r>
-        <w:t xml:space="preserve">Verse 1:3</w:t>
-      </w:r>
-    </w:p>
-    <w:p>
-      <w:pPr>
-        <w:pStyle w:val="FirstParagraph"/>
-      </w:pPr>
-      <m:oMathPara>
-        <m:oMathParaPr>
-          <m:jc m:val="center"/>
-        </m:oMathParaPr>
-        <m:oMath>
-          <m:m>
-            <m:mPr>
-              <m:baseJc m:val="center"/>
-              <m:plcHide m:val="on"/>
-              <m:mcs>
-                <m:mc>
-                  <m:mcPr>
-                    <m:mcJc m:val="left"/>
-                    <m:count m:val="1"/>
-                  </m:mcPr>
-                </m:mc>
-                <m:mc>
-                  <m:mcPr>
-                    <m:mcJc m:val="center"/>
-                    <m:count m:val="1"/>
-                  </m:mcPr>
-                </m:mc>
-                <m:mc>
-                  <m:mcPr>
-                    <m:mcJc m:val="center"/>
-                    <m:count m:val="1"/>
-                  </m:mcPr>
-                </m:mc>
-                <m:mc>
-                  <m:mcPr>
-                    <m:mcJc m:val="center"/>
-                    <m:count m:val="1"/>
-                  </m:mcPr>
-                </m:mc>
-              </m:mcs>
-            </m:mPr>
-            <m:mr>
-              <m:e>
-                <m:r>
-                  <m:rPr>
-                    <m:nor/>
-                    <m:sty m:val="b"/>
-                  </m:rPr>
-                  <m:t>πάντα</m:t>
-                </m:r>
-              </m:e>
-              <m:e>
-                <m:r>
-                  <m:rPr>
-                    <m:nor/>
-                    <m:sty m:val="b"/>
-                  </m:rPr>
-                  <m:t>δι’</m:t>
-                </m:r>
-              </m:e>
-              <m:e>
-                <m:r>
-                  <m:rPr>
-                    <m:nor/>
-                    <m:sty m:val="b"/>
-                  </m:rPr>
-                  <m:t>αὐτοῦ</m:t>
-                </m:r>
-              </m:e>
-              <m:e>
-                <m:r>
-                  <m:rPr>
-                    <m:nor/>
-                    <m:sty m:val="b"/>
-                  </m:rPr>
-                  <m:t>ἐγένετο,</m:t>
-                </m:r>
-              </m:e>
-            </m:mr>
-            <m:mr>
-              <m:e>
-                <m:r>
-                  <m:rPr>
-                    <m:nor/>
-                    <m:sty m:val="p"/>
-                  </m:rPr>
-                  <m:t>Panta</m:t>
-                </m:r>
-              </m:e>
-              <m:e>
-                <m:r>
-                  <m:rPr>
-                    <m:nor/>
-                    <m:sty m:val="p"/>
-                  </m:rPr>
-                  <m:t>di’</m:t>
-                </m:r>
-              </m:e>
-              <m:e>
-                <m:r>
-                  <m:rPr>
-                    <m:nor/>
-                    <m:sty m:val="p"/>
-                  </m:rPr>
-                  <m:t>autou</m:t>
-                </m:r>
-              </m:e>
-              <m:e>
-                <m:r>
-                  <m:rPr>
-                    <m:nor/>
-                    <m:sty m:val="p"/>
-                  </m:rPr>
-                  <m:t>egeneto,</m:t>
-                </m:r>
-              </m:e>
-            </m:mr>
-            <m:mr>
-              <m:e>
-                <m:r>
-                  <m:rPr>
-                    <m:nor/>
-                    <m:sty m:val="p"/>
-                  </m:rPr>
-                  <m:t>[All things]</m:t>
-                </m:r>
-              </m:e>
-              <m:e>
-                <m:r>
-                  <m:rPr>
-                    <m:nor/>
-                    <m:sty m:val="p"/>
-                  </m:rPr>
-                  <m:t>[through]</m:t>
-                </m:r>
-              </m:e>
-              <m:e>
-                <m:r>
-                  <m:rPr>
-                    <m:nor/>
-                    <m:sty m:val="p"/>
-                  </m:rPr>
-                  <m:t>[it/him]</m:t>
-                </m:r>
-              </m:e>
-              <m:e>
-                <m:r>
-                  <m:rPr>
-                    <m:nor/>
-                    <m:sty m:val="p"/>
-                  </m:rPr>
-                  <m:t>[came into being / emerged],</m:t>
-                </m:r>
-              </m:e>
-            </m:mr>
-          </m:m>
-        </m:oMath>
-      </m:oMathPara>
-    </w:p>
-    <w:p>
-      <w:pPr>
-        <w:pStyle w:val="FirstParagraph"/>
-      </w:pPr>
-      <m:oMathPara>
-        <m:oMathParaPr>
-          <m:jc m:val="center"/>
-        </m:oMathParaPr>
-        <m:oMath>
-          <m:m>
-            <m:mPr>
-              <m:baseJc m:val="center"/>
-              <m:plcHide m:val="on"/>
-              <m:mcs>
-                <m:mc>
-                  <m:mcPr>
-                    <m:mcJc m:val="left"/>
-                    <m:count m:val="1"/>
-                  </m:mcPr>
-                </m:mc>
-                <m:mc>
-                  <m:mcPr>
-                    <m:mcJc m:val="center"/>
-                    <m:count m:val="1"/>
-                  </m:mcPr>
-                </m:mc>
-                <m:mc>
-                  <m:mcPr>
-                    <m:mcJc m:val="center"/>
-                    <m:count m:val="1"/>
-                  </m:mcPr>
-                </m:mc>
-                <m:mc>
-                  <m:mcPr>
-                    <m:mcJc m:val="center"/>
-                    <m:count m:val="1"/>
-                  </m:mcPr>
-                </m:mc>
-                <m:mc>
-                  <m:mcPr>
-                    <m:mcJc m:val="center"/>
-                    <m:count m:val="1"/>
-                  </m:mcPr>
-                </m:mc>
-                <m:mc>
-                  <m:mcPr>
-                    <m:mcJc m:val="center"/>
-                    <m:count m:val="1"/>
-                  </m:mcPr>
-                </m:mc>
-                <m:mc>
-                  <m:mcPr>
-                    <m:mcJc m:val="center"/>
-                    <m:count m:val="1"/>
-                  </m:mcPr>
-                </m:mc>
-                <m:mc>
-                  <m:mcPr>
-                    <m:mcJc m:val="center"/>
-                    <m:count m:val="1"/>
-                  </m:mcPr>
-                </m:mc>
-              </m:mcs>
-            </m:mPr>
-            <m:mr>
-              <m:e>
-                <m:r>
-                  <m:rPr>
-                    <m:nor/>
-                    <m:sty m:val="b"/>
-                  </m:rPr>
-                  <m:t>καὶ</m:t>
-                </m:r>
-              </m:e>
-              <m:e>
-                <m:r>
-                  <m:rPr>
-                    <m:nor/>
-                    <m:sty m:val="b"/>
-                  </m:rPr>
-                  <m:t>χωρὶς</m:t>
-                </m:r>
-              </m:e>
-              <m:e>
-                <m:r>
-                  <m:rPr>
-                    <m:nor/>
-                    <m:sty m:val="b"/>
-                  </m:rPr>
-                  <m:t>αὐτοῦ</m:t>
-                </m:r>
-              </m:e>
-              <m:e>
-                <m:r>
-                  <m:rPr>
-                    <m:nor/>
-                    <m:sty m:val="b"/>
-                  </m:rPr>
-                  <m:t>ἐγένετο</m:t>
-                </m:r>
-              </m:e>
-              <m:e>
-                <m:r>
-                  <m:rPr>
-                    <m:nor/>
-                    <m:sty m:val="b"/>
-                  </m:rPr>
-                  <m:t>οὐδὲ</m:t>
-                </m:r>
-              </m:e>
-              <m:e>
-                <m:r>
-                  <m:rPr>
-                    <m:nor/>
-                    <m:sty m:val="b"/>
-                  </m:rPr>
-                  <m:t>ἕν</m:t>
-                </m:r>
-              </m:e>
-              <m:e>
-                <m:r>
-                  <m:rPr>
-                    <m:nor/>
-                    <m:sty m:val="b"/>
-                  </m:rPr>
-                  <m:t>ὃ</m:t>
-                </m:r>
-              </m:e>
-              <m:e>
-                <m:r>
-                  <m:rPr>
-                    <m:nor/>
-                    <m:sty m:val="b"/>
-                  </m:rPr>
-                  <m:t>γέγονεν.</m:t>
-                </m:r>
-              </m:e>
-            </m:mr>
-            <m:mr>
-              <m:e>
-                <m:r>
-                  <m:rPr>
-                    <m:nor/>
-                    <m:sty m:val="p"/>
-                  </m:rPr>
-                  <m:t>kai</m:t>
-                </m:r>
-              </m:e>
-              <m:e>
-                <m:r>
-                  <m:rPr>
-                    <m:nor/>
-                    <m:sty m:val="p"/>
-                  </m:rPr>
-                  <m:t>chōris</m:t>
-                </m:r>
-              </m:e>
-              <m:e>
-                <m:r>
-                  <m:rPr>
-                    <m:nor/>
-                    <m:sty m:val="p"/>
-                  </m:rPr>
-                  <m:t>autou</m:t>
-                </m:r>
-              </m:e>
-              <m:e>
-                <m:r>
-                  <m:rPr>
-                    <m:nor/>
-                    <m:sty m:val="p"/>
-                  </m:rPr>
-                  <m:t>egeneto</m:t>
-                </m:r>
-              </m:e>
-              <m:e>
-                <m:r>
-                  <m:rPr>
-                    <m:nor/>
-                    <m:sty m:val="p"/>
-                  </m:rPr>
-                  <m:t>oude</m:t>
-                </m:r>
-              </m:e>
-              <m:e>
-                <m:r>
-                  <m:rPr>
-                    <m:nor/>
-                    <m:sty m:val="p"/>
-                  </m:rPr>
-                  <m:t>hen</m:t>
-                </m:r>
-              </m:e>
-              <m:e>
-                <m:r>
-                  <m:rPr>
-                    <m:nor/>
-                    <m:sty m:val="p"/>
-                  </m:rPr>
-                  <m:t>ho</m:t>
-                </m:r>
-              </m:e>
-              <m:e>
-                <m:r>
-                  <m:rPr>
-                    <m:nor/>
-                    <m:sty m:val="p"/>
-                  </m:rPr>
-                  <m:t>gegonen.</m:t>
-                </m:r>
-              </m:e>
-            </m:mr>
-            <m:mr>
-              <m:e>
-                <m:r>
-                  <m:rPr>
-                    <m:nor/>
-                    <m:sty m:val="p"/>
-                  </m:rPr>
-                  <m:t>[and]</m:t>
-                </m:r>
-              </m:e>
-              <m:e>
-                <m:r>
-                  <m:rPr>
-                    <m:nor/>
-                    <m:sty m:val="p"/>
-                  </m:rPr>
-                  <m:t>[apart from]</m:t>
-                </m:r>
-              </m:e>
-              <m:e>
-                <m:r>
-                  <m:rPr>
-                    <m:nor/>
-                    <m:sty m:val="p"/>
-                  </m:rPr>
-                  <m:t>[it/him]</m:t>
-                </m:r>
-              </m:e>
-              <m:e>
-                <m:r>
-                  <m:rPr>
-                    <m:nor/>
-                    <m:sty m:val="p"/>
-                  </m:rPr>
-                  <m:t>[came into being]</m:t>
-                </m:r>
-              </m:e>
-              <m:e>
-                <m:r>
-                  <m:rPr>
-                    <m:nor/>
-                    <m:sty m:val="p"/>
-                  </m:rPr>
-                  <m:t>[not even]</m:t>
-                </m:r>
-              </m:e>
-              <m:e>
-                <m:r>
-                  <m:rPr>
-                    <m:nor/>
-                    <m:sty m:val="p"/>
-                  </m:rPr>
-                  <m:t>[one single thing]</m:t>
-                </m:r>
-              </m:e>
-              <m:e>
-                <m:r>
-                  <m:rPr>
-                    <m:nor/>
-                    <m:sty m:val="p"/>
-                  </m:rPr>
-                  <m:t>[that]</m:t>
-                </m:r>
-              </m:e>
-              <m:e>
-                <m:r>
-                  <m:rPr>
-                    <m:nor/>
-                    <m:sty m:val="p"/>
-                  </m:rPr>
-                  <m:t>[has come to be].</m:t>
-                </m:r>
-              </m:e>
-            </m:mr>
-          </m:m>
-        </m:oMath>
-      </m:oMathPara>
-    </w:p>
-    <w:p>
-      <w:r>
-        <w:pict>
-          <v:rect style="width:0;height:1.5pt" o:hralign="center" o:hrstd="t" o:hr="t"/>
-        </w:pict>
-      </w:r>
-    </w:p>
     <w:bookmarkEnd w:id="12"/>
-    <w:bookmarkStart w:id="13" w:name="verse-14"/>
-    <w:p>
-      <w:pPr>
-        <w:pStyle w:val="Heading3"/>
-      </w:pPr>
-      <w:r>
-        <w:t xml:space="preserve">Verse 1:4</w:t>
-      </w:r>
-    </w:p>
-    <w:p>
-      <w:pPr>
-        <w:pStyle w:val="FirstParagraph"/>
-      </w:pPr>
-      <m:oMathPara>
-        <m:oMathParaPr>
-          <m:jc m:val="center"/>
-        </m:oMathParaPr>
-        <m:oMath>
-          <m:m>
-            <m:mPr>
-              <m:baseJc m:val="center"/>
-              <m:plcHide m:val="on"/>
-              <m:mcs>
-                <m:mc>
-                  <m:mcPr>
-                    <m:mcJc m:val="left"/>
-                    <m:count m:val="1"/>
-                  </m:mcPr>
-                </m:mc>
-                <m:mc>
-                  <m:mcPr>
-                    <m:mcJc m:val="center"/>
-                    <m:count m:val="1"/>
-                  </m:mcPr>
-                </m:mc>
-                <m:mc>
-                  <m:mcPr>
-                    <m:mcJc m:val="center"/>
-                    <m:count m:val="1"/>
-                  </m:mcPr>
-                </m:mc>
-                <m:mc>
-                  <m:mcPr>
-                    <m:mcJc m:val="center"/>
-                    <m:count m:val="1"/>
-                  </m:mcPr>
-                </m:mc>
-              </m:mcs>
-            </m:mPr>
-            <m:mr>
-              <m:e>
-                <m:r>
-                  <m:rPr>
-                    <m:nor/>
-                    <m:sty m:val="b"/>
-                  </m:rPr>
-                  <m:t>ἐν</m:t>
-                </m:r>
-              </m:e>
-              <m:e>
-                <m:r>
-                  <m:rPr>
-                    <m:nor/>
-                    <m:sty m:val="b"/>
-                  </m:rPr>
-                  <m:t>αὐτῷ</m:t>
-                </m:r>
-              </m:e>
-              <m:e>
-                <m:r>
-                  <m:rPr>
-                    <m:nor/>
-                    <m:sty m:val="b"/>
-                  </m:rPr>
-                  <m:t>ζωὴ</m:t>
-                </m:r>
-              </m:e>
-              <m:e>
-                <m:r>
-                  <m:rPr>
-                    <m:nor/>
-                    <m:sty m:val="b"/>
-                  </m:rPr>
-                  <m:t>ἦν,</m:t>
-                </m:r>
-              </m:e>
-            </m:mr>
-            <m:mr>
-              <m:e>
-                <m:r>
-                  <m:rPr>
-                    <m:nor/>
-                    <m:sty m:val="p"/>
-                  </m:rPr>
-                  <m:t>en</m:t>
-                </m:r>
-              </m:e>
-              <m:e>
-                <m:r>
-                  <m:rPr>
-                    <m:nor/>
-                    <m:sty m:val="p"/>
-                  </m:rPr>
-                  <m:t>autō</m:t>
-                </m:r>
-              </m:e>
-              <m:e>
-                <m:r>
-                  <m:rPr>
-                    <m:nor/>
-                    <m:sty m:val="p"/>
-                  </m:rPr>
-                  <m:t>zōē</m:t>
-                </m:r>
-              </m:e>
-              <m:e>
-                <m:r>
-                  <m:rPr>
-                    <m:nor/>
-                    <m:sty m:val="p"/>
-                  </m:rPr>
-                  <m:t>ēn,</m:t>
-                </m:r>
-              </m:e>
-            </m:mr>
-            <m:mr>
-              <m:e>
-                <m:r>
-                  <m:rPr>
-                    <m:nor/>
-                    <m:sty m:val="p"/>
-                  </m:rPr>
-                  <m:t>[In]</m:t>
-                </m:r>
-              </m:e>
-              <m:e>
-                <m:r>
-                  <m:rPr>
-                    <m:nor/>
-                    <m:sty m:val="p"/>
-                  </m:rPr>
-                  <m:t>[it/him]</m:t>
-                </m:r>
-              </m:e>
-              <m:e>
-                <m:r>
-                  <m:rPr>
-                    <m:nor/>
-                    <m:sty m:val="p"/>
-                  </m:rPr>
-                  <m:t>[Life]</m:t>
-                </m:r>
-              </m:e>
-              <m:e>
-                <m:r>
-                  <m:rPr>
-                    <m:nor/>
-                    <m:sty m:val="p"/>
-                  </m:rPr>
-                  <m:t>[was / resided],</m:t>
-                </m:r>
-              </m:e>
-            </m:mr>
-          </m:m>
-        </m:oMath>
-      </m:oMathPara>
-    </w:p>
-    <w:p>
-      <w:pPr>
-        <w:pStyle w:val="FirstParagraph"/>
-      </w:pPr>
-      <m:oMathPara>
-        <m:oMathParaPr>
-          <m:jc m:val="center"/>
-        </m:oMathParaPr>
-        <m:oMath>
-          <m:m>
-            <m:mPr>
-              <m:baseJc m:val="center"/>
-              <m:plcHide m:val="on"/>
-              <m:mcs>
-                <m:mc>
-                  <m:mcPr>
-                    <m:mcJc m:val="left"/>
-                    <m:count m:val="1"/>
-                  </m:mcPr>
-                </m:mc>
-                <m:mc>
-                  <m:mcPr>
-                    <m:mcJc m:val="center"/>
-                    <m:count m:val="1"/>
-                  </m:mcPr>
-                </m:mc>
-                <m:mc>
-                  <m:mcPr>
-                    <m:mcJc m:val="center"/>
-                    <m:count m:val="1"/>
-                  </m:mcPr>
-                </m:mc>
-                <m:mc>
-                  <m:mcPr>
-                    <m:mcJc m:val="center"/>
-                    <m:count m:val="1"/>
-                  </m:mcPr>
-                </m:mc>
-                <m:mc>
-                  <m:mcPr>
-                    <m:mcJc m:val="center"/>
-                    <m:count m:val="1"/>
-                  </m:mcPr>
-                </m:mc>
-                <m:mc>
-                  <m:mcPr>
-                    <m:mcJc m:val="center"/>
-                    <m:count m:val="1"/>
-                  </m:mcPr>
-                </m:mc>
-                <m:mc>
-                  <m:mcPr>
-                    <m:mcJc m:val="center"/>
-                    <m:count m:val="1"/>
-                  </m:mcPr>
-                </m:mc>
-                <m:mc>
-                  <m:mcPr>
-                    <m:mcJc m:val="center"/>
-                    <m:count m:val="1"/>
-                  </m:mcPr>
-                </m:mc>
-              </m:mcs>
-            </m:mPr>
-            <m:mr>
-              <m:e>
-                <m:r>
-                  <m:rPr>
-                    <m:nor/>
-                    <m:sty m:val="b"/>
-                  </m:rPr>
-                  <m:t>καὶ</m:t>
-                </m:r>
-              </m:e>
-              <m:e>
-                <m:r>
-                  <m:rPr>
-                    <m:nor/>
-                    <m:sty m:val="b"/>
-                  </m:rPr>
-                  <m:t>ἡ</m:t>
-                </m:r>
-              </m:e>
-              <m:e>
-                <m:r>
-                  <m:rPr>
-                    <m:nor/>
-                    <m:sty m:val="b"/>
-                  </m:rPr>
-                  <m:t>ζωὴ</m:t>
-                </m:r>
-              </m:e>
-              <m:e>
-                <m:r>
-                  <m:rPr>
-                    <m:nor/>
-                    <m:sty m:val="b"/>
-                  </m:rPr>
-                  <m:t>ἦν</m:t>
-                </m:r>
-              </m:e>
-              <m:e>
-                <m:r>
-                  <m:rPr>
-                    <m:nor/>
-                    <m:sty m:val="b"/>
-                  </m:rPr>
-                  <m:t>τὸ</m:t>
-                </m:r>
-              </m:e>
-              <m:e>
-                <m:r>
-                  <m:rPr>
-                    <m:nor/>
-                    <m:sty m:val="b"/>
-                  </m:rPr>
-                  <m:t>φῶς</m:t>
-                </m:r>
-              </m:e>
-              <m:e>
-                <m:r>
-                  <m:rPr>
-                    <m:nor/>
-                    <m:sty m:val="b"/>
-                  </m:rPr>
-                  <m:t>τῶν</m:t>
-                </m:r>
-              </m:e>
-              <m:e>
-                <m:r>
-                  <m:rPr>
-                    <m:nor/>
-                    <m:sty m:val="b"/>
-                  </m:rPr>
-                  <m:t>ἀνθρώπων·</m:t>
-                </m:r>
-              </m:e>
-            </m:mr>
-            <m:mr>
-              <m:e>
-                <m:r>
-                  <m:rPr>
-                    <m:nor/>
-                    <m:sty m:val="p"/>
-                  </m:rPr>
-                  <m:t>kai</m:t>
-                </m:r>
-              </m:e>
-              <m:e>
-                <m:r>
-                  <m:rPr>
-                    <m:nor/>
-                    <m:sty m:val="p"/>
-                  </m:rPr>
-                  <m:t>hē</m:t>
-                </m:r>
-              </m:e>
-              <m:e>
-                <m:r>
-                  <m:rPr>
-                    <m:nor/>
-                    <m:sty m:val="p"/>
-                  </m:rPr>
-                  <m:t>zōē</m:t>
-                </m:r>
-              </m:e>
-              <m:e>
-                <m:r>
-                  <m:rPr>
-                    <m:nor/>
-                    <m:sty m:val="p"/>
-                  </m:rPr>
-                  <m:t>ēn</m:t>
-                </m:r>
-              </m:e>
-              <m:e>
-                <m:r>
-                  <m:rPr>
-                    <m:nor/>
-                    <m:sty m:val="p"/>
-                  </m:rPr>
-                  <m:t>to</m:t>
-                </m:r>
-              </m:e>
-              <m:e>
-                <m:r>
-                  <m:rPr>
-                    <m:nor/>
-                    <m:sty m:val="p"/>
-                  </m:rPr>
-                  <m:t>phōs</m:t>
-                </m:r>
-              </m:e>
-              <m:e>
-                <m:r>
-                  <m:rPr>
-                    <m:nor/>
-                    <m:sty m:val="p"/>
-                  </m:rPr>
-                  <m:t>tōn</m:t>
-                </m:r>
-              </m:e>
-              <m:e>
-                <m:r>
-                  <m:rPr>
-                    <m:nor/>
-                    <m:sty m:val="p"/>
-                  </m:rPr>
-                  <m:t>anthrōpōn;</m:t>
-                </m:r>
-              </m:e>
-            </m:mr>
-            <m:mr>
-              <m:e>
-                <m:r>
-                  <m:rPr>
-                    <m:nor/>
-                    <m:sty m:val="p"/>
-                  </m:rPr>
-                  <m:t>[and]</m:t>
-                </m:r>
-              </m:e>
-              <m:e>
-                <m:r>
-                  <m:rPr>
-                    <m:nor/>
-                    <m:sty m:val="p"/>
-                  </m:rPr>
-                  <m:t>[the]</m:t>
-                </m:r>
-              </m:e>
-              <m:e>
-                <m:r>
-                  <m:rPr>
-                    <m:nor/>
-                    <m:sty m:val="p"/>
-                  </m:rPr>
-                  <m:t>[Life]</m:t>
-                </m:r>
-              </m:e>
-              <m:e>
-                <m:r>
-                  <m:rPr>
-                    <m:nor/>
-                    <m:sty m:val="p"/>
-                  </m:rPr>
-                  <m:t>[was]</m:t>
-                </m:r>
-              </m:e>
-              <m:e>
-                <m:r>
-                  <m:rPr>
-                    <m:nor/>
-                    <m:sty m:val="p"/>
-                  </m:rPr>
-                  <m:t>[the]</m:t>
-                </m:r>
-              </m:e>
-              <m:e>
-                <m:r>
-                  <m:rPr>
-                    <m:nor/>
-                    <m:sty m:val="p"/>
-                  </m:rPr>
-                  <m:t>[Light]</m:t>
-                </m:r>
-              </m:e>
-              <m:e>
-                <m:r>
-                  <m:rPr>
-                    <m:nor/>
-                    <m:sty m:val="p"/>
-                  </m:rPr>
-                  <m:t>[of]</m:t>
-                </m:r>
-              </m:e>
-              <m:e>
-                <m:r>
-                  <m:rPr>
-                    <m:nor/>
-                    <m:sty m:val="p"/>
-                  </m:rPr>
-                  <m:t>[human beings];</m:t>
-                </m:r>
-              </m:e>
-            </m:mr>
-          </m:m>
-        </m:oMath>
-      </m:oMathPara>
-    </w:p>
-    <w:p>
-      <w:r>
-        <w:pict>
-          <v:rect style="width:0;height:1.5pt" o:hralign="center" o:hrstd="t" o:hr="t"/>
-        </w:pict>
-      </w:r>
-    </w:p>
     <w:bookmarkEnd w:id="13"/>
-    <w:bookmarkStart w:id="14" w:name="verse-15"/>
-    <w:p>
-      <w:pPr>
-        <w:pStyle w:val="Heading3"/>
-      </w:pPr>
-      <w:r>
-        <w:t xml:space="preserve">Verse 1:5</w:t>
-      </w:r>
-    </w:p>
-    <w:p>
-      <w:pPr>
-        <w:pStyle w:val="FirstParagraph"/>
-      </w:pPr>
-      <m:oMathPara>
-        <m:oMathParaPr>
-          <m:jc m:val="center"/>
-        </m:oMathParaPr>
-        <m:oMath>
-          <m:m>
-            <m:mPr>
-              <m:baseJc m:val="center"/>
-              <m:plcHide m:val="on"/>
-              <m:mcs>
-                <m:mc>
-                  <m:mcPr>
-                    <m:mcJc m:val="left"/>
-                    <m:count m:val="1"/>
-                  </m:mcPr>
-                </m:mc>
-                <m:mc>
-                  <m:mcPr>
-                    <m:mcJc m:val="center"/>
-                    <m:count m:val="1"/>
-                  </m:mcPr>
-                </m:mc>
-                <m:mc>
-                  <m:mcPr>
-                    <m:mcJc m:val="center"/>
-                    <m:count m:val="1"/>
-                  </m:mcPr>
-                </m:mc>
-                <m:mc>
-                  <m:mcPr>
-                    <m:mcJc m:val="center"/>
-                    <m:count m:val="1"/>
-                  </m:mcPr>
-                </m:mc>
-                <m:mc>
-                  <m:mcPr>
-                    <m:mcJc m:val="center"/>
-                    <m:count m:val="1"/>
-                  </m:mcPr>
-                </m:mc>
-                <m:mc>
-                  <m:mcPr>
-                    <m:mcJc m:val="center"/>
-                    <m:count m:val="1"/>
-                  </m:mcPr>
-                </m:mc>
-                <m:mc>
-                  <m:mcPr>
-                    <m:mcJc m:val="center"/>
-                    <m:count m:val="1"/>
-                  </m:mcPr>
-                </m:mc>
-              </m:mcs>
-            </m:mPr>
-            <m:mr>
-              <m:e>
-                <m:r>
-                  <m:rPr>
-                    <m:nor/>
-                    <m:sty m:val="b"/>
-                  </m:rPr>
-                  <m:t>καὶ</m:t>
-                </m:r>
-              </m:e>
-              <m:e>
-                <m:r>
-                  <m:rPr>
-                    <m:nor/>
-                    <m:sty m:val="b"/>
-                  </m:rPr>
-                  <m:t>τὸ</m:t>
-                </m:r>
-              </m:e>
-              <m:e>
-                <m:r>
-                  <m:rPr>
-                    <m:nor/>
-                    <m:sty m:val="b"/>
-                  </m:rPr>
-                  <m:t>φῶς</m:t>
-                </m:r>
-              </m:e>
-              <m:e>
-                <m:r>
-                  <m:rPr>
-                    <m:nor/>
-                    <m:sty m:val="b"/>
-                  </m:rPr>
-                  <m:t>ἐν</m:t>
-                </m:r>
-              </m:e>
-              <m:e>
-                <m:r>
-                  <m:rPr>
-                    <m:nor/>
-                    <m:sty m:val="b"/>
-                  </m:rPr>
-                  <m:t>τῇ</m:t>
-                </m:r>
-              </m:e>
-              <m:e>
-                <m:r>
-                  <m:rPr>
-                    <m:nor/>
-                    <m:sty m:val="b"/>
-                  </m:rPr>
-                  <m:t>σκοτίᾳ</m:t>
-                </m:r>
-              </m:e>
-              <m:e>
-                <m:r>
-                  <m:rPr>
-                    <m:nor/>
-                    <m:sty m:val="b"/>
-                  </m:rPr>
-                  <m:t>φαίνει,</m:t>
-                </m:r>
-              </m:e>
-            </m:mr>
-            <m:mr>
-              <m:e>
-                <m:r>
-                  <m:rPr>
-                    <m:nor/>
-                    <m:sty m:val="p"/>
-                  </m:rPr>
-                  <m:t>kai</m:t>
-                </m:r>
-              </m:e>
-              <m:e>
-                <m:r>
-                  <m:rPr>
-                    <m:nor/>
-                    <m:sty m:val="p"/>
-                  </m:rPr>
-                  <m:t>to</m:t>
-                </m:r>
-              </m:e>
-              <m:e>
-                <m:r>
-                  <m:rPr>
-                    <m:nor/>
-                    <m:sty m:val="p"/>
-                  </m:rPr>
-                  <m:t>phōs</m:t>
-                </m:r>
-              </m:e>
-              <m:e>
-                <m:r>
-                  <m:rPr>
-                    <m:nor/>
-                    <m:sty m:val="p"/>
-                  </m:rPr>
-                  <m:t>en</m:t>
-                </m:r>
-              </m:e>
-              <m:e>
-                <m:r>
-                  <m:rPr>
-                    <m:nor/>
-                    <m:sty m:val="p"/>
-                  </m:rPr>
-                  <m:t>tē</m:t>
-                </m:r>
-              </m:e>
-              <m:e>
-                <m:r>
-                  <m:rPr>
-                    <m:nor/>
-                    <m:sty m:val="p"/>
-                  </m:rPr>
-                  <m:t>skotia</m:t>
-                </m:r>
-              </m:e>
-              <m:e>
-                <m:r>
-                  <m:rPr>
-                    <m:nor/>
-                    <m:sty m:val="p"/>
-                  </m:rPr>
-                  <m:t>phainei,</m:t>
-                </m:r>
-              </m:e>
-            </m:mr>
-            <m:mr>
-              <m:e>
-                <m:r>
-                  <m:rPr>
-                    <m:nor/>
-                    <m:sty m:val="p"/>
-                  </m:rPr>
-                  <m:t>[and]</m:t>
-                </m:r>
-              </m:e>
-              <m:e>
-                <m:r>
-                  <m:rPr>
-                    <m:nor/>
-                    <m:sty m:val="p"/>
-                  </m:rPr>
-                  <m:t>[the]</m:t>
-                </m:r>
-              </m:e>
-              <m:e>
-                <m:r>
-                  <m:rPr>
-                    <m:nor/>
-                    <m:sty m:val="p"/>
-                  </m:rPr>
-                  <m:t>[Light]</m:t>
-                </m:r>
-              </m:e>
-              <m:e>
-                <m:r>
-                  <m:rPr>
-                    <m:nor/>
-                    <m:sty m:val="p"/>
-                  </m:rPr>
-                  <m:t>[in]</m:t>
-                </m:r>
-              </m:e>
-              <m:e>
-                <m:r>
-                  <m:rPr>
-                    <m:nor/>
-                    <m:sty m:val="p"/>
-                  </m:rPr>
-                  <m:t>[the]</m:t>
-                </m:r>
-              </m:e>
-              <m:e>
-                <m:r>
-                  <m:rPr>
-                    <m:nor/>
-                    <m:sty m:val="p"/>
-                  </m:rPr>
-                  <m:t>[darkness]</m:t>
-                </m:r>
-              </m:e>
-              <m:e>
-                <m:r>
-                  <m:rPr>
-                    <m:nor/>
-                    <m:sty m:val="p"/>
-                  </m:rPr>
-                  <m:t>[shines],</m:t>
-                </m:r>
-              </m:e>
-            </m:mr>
-          </m:m>
-        </m:oMath>
-      </m:oMathPara>
-    </w:p>
-    <w:p>
-      <w:pPr>
-        <w:pStyle w:val="FirstParagraph"/>
-      </w:pPr>
-      <m:oMathPara>
-        <m:oMathParaPr>
-          <m:jc m:val="center"/>
-        </m:oMathParaPr>
-        <m:oMath>
-          <m:m>
-            <m:mPr>
-              <m:baseJc m:val="center"/>
-              <m:plcHide m:val="on"/>
-              <m:mcs>
-                <m:mc>
-                  <m:mcPr>
-                    <m:mcJc m:val="left"/>
-                    <m:count m:val="1"/>
-                  </m:mcPr>
-                </m:mc>
-                <m:mc>
-                  <m:mcPr>
-                    <m:mcJc m:val="center"/>
-                    <m:count m:val="1"/>
-                  </m:mcPr>
-                </m:mc>
-                <m:mc>
-                  <m:mcPr>
-                    <m:mcJc m:val="center"/>
-                    <m:count m:val="1"/>
-                  </m:mcPr>
-                </m:mc>
-                <m:mc>
-                  <m:mcPr>
-                    <m:mcJc m:val="center"/>
-                    <m:count m:val="1"/>
-                  </m:mcPr>
-                </m:mc>
-                <m:mc>
-                  <m:mcPr>
-                    <m:mcJc m:val="center"/>
-                    <m:count m:val="1"/>
-                  </m:mcPr>
-                </m:mc>
-                <m:mc>
-                  <m:mcPr>
-                    <m:mcJc m:val="center"/>
-                    <m:count m:val="1"/>
-                  </m:mcPr>
-                </m:mc>
-              </m:mcs>
-            </m:mPr>
-            <m:mr>
-              <m:e>
-                <m:r>
-                  <m:rPr>
-                    <m:nor/>
-                    <m:sty m:val="b"/>
-                  </m:rPr>
-                  <m:t>καὶ</m:t>
-                </m:r>
-              </m:e>
-              <m:e>
-                <m:r>
-                  <m:rPr>
-                    <m:nor/>
-                    <m:sty m:val="b"/>
-                  </m:rPr>
-                  <m:t>ἡ</m:t>
-                </m:r>
-              </m:e>
-              <m:e>
-                <m:r>
-                  <m:rPr>
-                    <m:nor/>
-                    <m:sty m:val="b"/>
-                  </m:rPr>
-                  <m:t>σκοτία</m:t>
-                </m:r>
-              </m:e>
-              <m:e>
-                <m:r>
-                  <m:rPr>
-                    <m:nor/>
-                    <m:sty m:val="b"/>
-                  </m:rPr>
-                  <m:t>αὐτὸ</m:t>
-                </m:r>
-              </m:e>
-              <m:e>
-                <m:r>
-                  <m:rPr>
-                    <m:nor/>
-                    <m:sty m:val="b"/>
-                  </m:rPr>
-                  <m:t>οὐ</m:t>
-                </m:r>
-              </m:e>
-              <m:e>
-                <m:r>
-                  <m:rPr>
-                    <m:nor/>
-                    <m:sty m:val="b"/>
-                  </m:rPr>
-                  <m:t>κατέλαβεν.</m:t>
-                </m:r>
-              </m:e>
-            </m:mr>
-            <m:mr>
-              <m:e>
-                <m:r>
-                  <m:rPr>
-                    <m:nor/>
-                    <m:sty m:val="p"/>
-                  </m:rPr>
-                  <m:t>kai</m:t>
-                </m:r>
-              </m:e>
-              <m:e>
-                <m:r>
-                  <m:rPr>
-                    <m:nor/>
-                    <m:sty m:val="p"/>
-                  </m:rPr>
-                  <m:t>hē</m:t>
-                </m:r>
-              </m:e>
-              <m:e>
-                <m:r>
-                  <m:rPr>
-                    <m:nor/>
-                    <m:sty m:val="p"/>
-                  </m:rPr>
-                  <m:t>skotia</m:t>
-                </m:r>
-              </m:e>
-              <m:e>
-                <m:r>
-                  <m:rPr>
-                    <m:nor/>
-                    <m:sty m:val="p"/>
-                  </m:rPr>
-                  <m:t>auto</m:t>
-                </m:r>
-              </m:e>
-              <m:e>
-                <m:r>
-                  <m:rPr>
-                    <m:nor/>
-                    <m:sty m:val="p"/>
-                  </m:rPr>
-                  <m:t>ou</m:t>
-                </m:r>
-              </m:e>
-              <m:e>
-                <m:r>
-                  <m:rPr>
-                    <m:nor/>
-                    <m:sty m:val="p"/>
-                  </m:rPr>
-                  <m:t>katelaben.</m:t>
-                </m:r>
-              </m:e>
-            </m:mr>
-            <m:mr>
-              <m:e>
-                <m:r>
-                  <m:rPr>
-                    <m:nor/>
-                    <m:sty m:val="p"/>
-                  </m:rPr>
-                  <m:t>[and]</m:t>
-                </m:r>
-              </m:e>
-              <m:e>
-                <m:r>
-                  <m:rPr>
-                    <m:nor/>
-                    <m:sty m:val="p"/>
-                  </m:rPr>
-                  <m:t>[the]</m:t>
-                </m:r>
-              </m:e>
-              <m:e>
-                <m:r>
-                  <m:rPr>
-                    <m:nor/>
-                    <m:sty m:val="p"/>
-                  </m:rPr>
-                  <m:t>[darkness]</m:t>
-                </m:r>
-              </m:e>
-              <m:e>
-                <m:r>
-                  <m:rPr>
-                    <m:nor/>
-                    <m:sty m:val="p"/>
-                  </m:rPr>
-                  <m:t>[it]</m:t>
-                </m:r>
-              </m:e>
-              <m:e>
-                <m:r>
-                  <m:rPr>
-                    <m:nor/>
-                    <m:sty m:val="p"/>
-                  </m:rPr>
-                  <m:t>[not]</m:t>
-                </m:r>
-              </m:e>
-              <m:e>
-                <m:r>
-                  <m:rPr>
-                    <m:nor/>
-                    <m:sty m:val="p"/>
-                  </m:rPr>
-                  <m:t>[overcame / extinguished / engulfed].</m:t>
-                </m:r>
-              </m:e>
-            </m:mr>
-          </m:m>
-        </m:oMath>
-      </m:oMathPara>
-    </w:p>
-    <w:p>
-      <w:r>
-        <w:pict>
-          <v:rect style="width:0;height:1.5pt" o:hralign="center" o:hrstd="t" o:hr="t"/>
-        </w:pict>
-      </w:r>
-    </w:p>
     <w:bookmarkEnd w:id="14"/>
-    <w:bookmarkEnd w:id="15"/>
-    <w:bookmarkStart w:id="18" w:name="continuous-reading-text"/>
+    <w:bookmarkStart w:id="20" w:name="X754e7429c1498f5002b2d78083046fb869a6977"/>
     <w:p>
       <w:pPr>
         <w:pStyle w:val="Heading2"/>
       </w:pPr>
       <w:r>
-        <w:t xml:space="preserve">2. Continuous Reading Text</w:t>
-      </w:r>
-    </w:p>
-    <w:bookmarkStart w:id="16" w:name="greek-original-nestle-aland-28"/>
-    <w:p>
-      <w:pPr>
-        <w:pStyle w:val="Heading3"/>
-      </w:pPr>
-      <w:r>
-        <w:t xml:space="preserve">Greek Original (Nestle-Aland 28)</w:t>
-      </w:r>
-    </w:p>
-    <w:p>
-      <w:pPr>
-        <w:pStyle w:val="BlockText"/>
-      </w:pPr>
-      <w:r>
-        <w:t xml:space="preserve">1:1 Ἐν ἀρχῇ ἦν ὁ λόγος, καὶ ὁ λόγος ἦν πρὸς τὸν θεόν, καὶ θεὸς ἦν ὁ λόγος.</w:t>
-      </w:r>
-      <w:r>
-        <w:br/>
-      </w:r>
-      <w:r>
-        <w:t xml:space="preserve">1:2 οὗτος ἦν ἐν ἀρχῇ πρὸς τὸν θεόν.</w:t>
-      </w:r>
-      <w:r>
-        <w:br/>
-      </w:r>
-      <w:r>
-        <w:t xml:space="preserve">1:3 πάντα δι’ αὐτοῦ ἐγένετο, καὶ χωρὶς αὐτοῦ ἐγένετο οὐδὲ ἕν ὃ γέγονεν.</w:t>
-      </w:r>
-      <w:r>
-        <w:br/>
-      </w:r>
-      <w:r>
-        <w:t xml:space="preserve">1:4 ἐν αὐτῷ ζωὴ ἦν, καὶ ἡ ζωὴ ἦν τὸ φῶς τῶν ἀνθρώπων·</w:t>
-      </w:r>
-      <w:r>
-        <w:br/>
-      </w:r>
-      <w:r>
-        <w:t xml:space="preserve">1:5 καὶ τὸ φῶς ἐν τῇ σκοτίᾳ φαίνει, καὶ ἡ σκοτία αὐτὸ οὐ κατέλαβεν.</w:t>
-      </w:r>
-    </w:p>
-    <w:bookmarkEnd w:id="16"/>
-    <w:bookmarkStart w:id="17" w:name="X9bac6132590244ad772866847a9672f313b596f"/>
-    <w:p>
-      <w:pPr>
-        <w:pStyle w:val="Heading3"/>
-      </w:pPr>
-      <w:r>
-        <w:t xml:space="preserve">Verse-by-Verse English Translation (Preserving the Logos)</w:t>
-      </w:r>
-    </w:p>
-    <w:p>
-      <w:pPr>
-        <w:pStyle w:val="BlockText"/>
-      </w:pPr>
-      <w:r>
-        <w:rPr>
-          <w:b/>
-          <w:bCs/>
-        </w:rPr>
-        <w:t xml:space="preserve">1:1</w:t>
-      </w:r>
-      <w:r>
-        <w:t xml:space="preserve"> </w:t>
-      </w:r>
-      <w:r>
-        <w:t xml:space="preserve">In the beginning [in the foundational origin] was the</w:t>
-      </w:r>
-      <w:r>
-        <w:t xml:space="preserve"> </w:t>
-      </w:r>
-      <w:r>
-        <w:rPr>
-          <w:b/>
-          <w:bCs/>
-        </w:rPr>
-        <w:t xml:space="preserve">Logos</w:t>
-      </w:r>
-      <w:r>
-        <w:t xml:space="preserve">, and the</w:t>
-      </w:r>
-      <w:r>
-        <w:t xml:space="preserve"> </w:t>
-      </w:r>
-      <w:r>
-        <w:rPr>
-          <w:b/>
-          <w:bCs/>
-        </w:rPr>
-        <w:t xml:space="preserve">Logos</w:t>
-      </w:r>
-      <w:r>
-        <w:t xml:space="preserve"> </w:t>
-      </w:r>
-      <w:r>
-        <w:t xml:space="preserve">was in dynamic relation with God, and divine in essence was the</w:t>
-      </w:r>
-      <w:r>
-        <w:t xml:space="preserve"> </w:t>
-      </w:r>
-      <w:r>
-        <w:rPr>
-          <w:b/>
-          <w:bCs/>
-        </w:rPr>
-        <w:t xml:space="preserve">Logos</w:t>
-      </w:r>
-      <w:r>
-        <w:t xml:space="preserve">.</w:t>
-      </w:r>
-      <w:r>
-        <w:br/>
-      </w:r>
-      <w:r>
-        <w:rPr>
-          <w:b/>
-          <w:bCs/>
-        </w:rPr>
-        <w:t xml:space="preserve">1:2</w:t>
-      </w:r>
-      <w:r>
-        <w:t xml:space="preserve"> </w:t>
-      </w:r>
-      <w:r>
-        <w:t xml:space="preserve">This very one was in the beginning in dynamic relation with God.</w:t>
-      </w:r>
-      <w:r>
-        <w:br/>
-      </w:r>
-      <w:r>
-        <w:rPr>
-          <w:b/>
-          <w:bCs/>
-        </w:rPr>
-        <w:t xml:space="preserve">1:3</w:t>
-      </w:r>
-      <w:r>
-        <w:t xml:space="preserve"> </w:t>
-      </w:r>
-      <w:r>
-        <w:t xml:space="preserve">All things came into being through it, and apart from it not a single thing came into being that has come to be.</w:t>
-      </w:r>
-      <w:r>
-        <w:br/>
-      </w:r>
-      <w:r>
-        <w:rPr>
-          <w:b/>
-          <w:bCs/>
-        </w:rPr>
-        <w:t xml:space="preserve">1:4</w:t>
-      </w:r>
-      <w:r>
-        <w:t xml:space="preserve"> </w:t>
-      </w:r>
-      <w:r>
-        <w:t xml:space="preserve">In it was Life, and the Life was the Light of humanity.</w:t>
-      </w:r>
-      <w:r>
-        <w:br/>
-      </w:r>
-      <w:r>
-        <w:rPr>
-          <w:b/>
-          <w:bCs/>
-        </w:rPr>
-        <w:t xml:space="preserve">1:5</w:t>
-      </w:r>
-      <w:r>
-        <w:t xml:space="preserve"> </w:t>
-      </w:r>
-      <w:r>
-        <w:t xml:space="preserve">And the Light shines in the darkness, and the darkness did not overcome it.</w:t>
-      </w:r>
-    </w:p>
-    <w:p>
-      <w:r>
-        <w:pict>
-          <v:rect style="width:0;height:1.5pt" o:hralign="center" o:hrstd="t" o:hr="t"/>
-        </w:pict>
-      </w:r>
-    </w:p>
-    <w:bookmarkEnd w:id="17"/>
-    <w:bookmarkEnd w:id="18"/>
-    <w:bookmarkStart w:id="24" w:name="X754e7429c1498f5002b2d78083046fb869a6977"/>
-    <w:p>
-      <w:pPr>
-        <w:pStyle w:val="Heading2"/>
-      </w:pPr>
-      <w:r>
-        <w:t xml:space="preserve">3. Philological &amp; Philosophical Treatise: Why Logos Must Not Be Translated as</w:t>
+        <w:t xml:space="preserve">2. Philological &amp; Philosophical Treatise: Why Logos Must Not Be Translated as</w:t>
       </w:r>
       <w:r>
         <w:t xml:space="preserve"> </w:t>
@@ -2888,7 +836,7 @@
         <w:rPr>
           <w:rStyle w:val="VerbatimChar"/>
         </w:rPr>
-        <w:t xml:space="preserve">graph TD</w:t>
+        <w:t xml:space="preserve">flowchart TD</w:t>
       </w:r>
       <w:r>
         <w:br/>
@@ -2897,7 +845,7 @@
         <w:rPr>
           <w:rStyle w:val="VerbatimChar"/>
         </w:rPr>
-        <w:t xml:space="preserve">    subgraph Antike [Ancient Logos Concept]</w:t>
+        <w:t xml:space="preserve">    subgraph Ancient ["1. Ancient Cosmological Logos"]</w:t>
       </w:r>
       <w:r>
         <w:br/>
@@ -2906,7 +854,7 @@
         <w:rPr>
           <w:rStyle w:val="VerbatimChar"/>
         </w:rPr>
-        <w:t xml:space="preserve">        L1["Cosmic Ordering Principle (Heraclitus)"]</w:t>
+        <w:t xml:space="preserve">        A["• Cosmic Ordering Principle &amp; Unifying Law (Heraclitus)&lt;br/&gt;• Generative Reason / Seminal Code (Stoic Physics)&lt;br/&gt;• Intelligible Matrix of Forms &amp; Laws (Philo of Alexandria)&lt;br/&gt;• Mathematical Ratio, Proportion &amp; Harmony (Pythagoras)"]</w:t>
       </w:r>
       <w:r>
         <w:br/>
@@ -2915,7 +863,10 @@
         <w:rPr>
           <w:rStyle w:val="VerbatimChar"/>
         </w:rPr>
-        <w:t xml:space="preserve">        L2["Generative Reason (Seminal Logos / Stoa)"]</w:t>
+        <w:t xml:space="preserve">    end</w:t>
+      </w:r>
+      <w:r>
+        <w:br/>
       </w:r>
       <w:r>
         <w:br/>
@@ -2924,7 +875,7 @@
         <w:rPr>
           <w:rStyle w:val="VerbatimChar"/>
         </w:rPr>
-        <w:t xml:space="preserve">        L3["Intelligible Matrix of Forms (Philo)"]</w:t>
+        <w:t xml:space="preserve">    subgraph Fallacy ["2. Historical Linguistic Reduction (Category Error)"]</w:t>
       </w:r>
       <w:r>
         <w:br/>
@@ -2933,7 +884,7 @@
         <w:rPr>
           <w:rStyle w:val="VerbatimChar"/>
         </w:rPr>
-        <w:t xml:space="preserve">        L4["Mathematical Proportion &amp; Relation (Euclid/Pythagoras)"]</w:t>
+        <w:t xml:space="preserve">        B["Latin: Verbum &amp;bull; English: 'Word' &amp;bull; German: 'Wort'&lt;br/&gt;(Diminished to acoustic speech, vocalization &amp; linguistic signs)"]</w:t>
       </w:r>
       <w:r>
         <w:br/>
@@ -2954,7 +905,7 @@
         <w:rPr>
           <w:rStyle w:val="VerbatimChar"/>
         </w:rPr>
-        <w:t xml:space="preserve">    subgraph Verengung [Linguistic Reduction]</w:t>
+        <w:t xml:space="preserve">    subgraph Modern ["3. Modern Physical Isomorphism (Quantum Information Theory)"]</w:t>
       </w:r>
       <w:r>
         <w:br/>
@@ -2963,7 +914,7 @@
         <w:rPr>
           <w:rStyle w:val="VerbatimChar"/>
         </w:rPr>
-        <w:t xml:space="preserve">        R1["Latin: Verbum"]</w:t>
+        <w:t xml:space="preserve">        C["• Universal Quantum Wavefunction |Ψ⟩ (Mind-at-Large)&lt;br/&gt;• Wheeler's 'It from Qubit' (Information Precedes Matter)&lt;br/&gt;• Non-Local Relational Entanglement Network (Bell Holism)"]</w:t>
       </w:r>
       <w:r>
         <w:br/>
@@ -2972,7 +923,10 @@
         <w:rPr>
           <w:rStyle w:val="VerbatimChar"/>
         </w:rPr>
-        <w:t xml:space="preserve">        R2["English: 'Word' / German: 'Wort'"]</w:t>
+        <w:t xml:space="preserve">    end</w:t>
+      </w:r>
+      <w:r>
+        <w:br/>
       </w:r>
       <w:r>
         <w:br/>
@@ -2981,10 +935,7 @@
         <w:rPr>
           <w:rStyle w:val="VerbatimChar"/>
         </w:rPr>
-        <w:t xml:space="preserve">    end</w:t>
-      </w:r>
-      <w:r>
-        <w:br/>
+        <w:t xml:space="preserve">    Ancient --&gt;|Severe Historical Truncation| Fallacy</w:t>
       </w:r>
       <w:r>
         <w:br/>
@@ -2993,7 +944,10 @@
         <w:rPr>
           <w:rStyle w:val="VerbatimChar"/>
         </w:rPr>
-        <w:t xml:space="preserve">    subgraph Moderne [Quantum Informational Matrix]</w:t>
+        <w:t xml:space="preserve">    Ancient &lt;==&gt;|Rigorous Ontological Isomorphism| Modern</w:t>
+      </w:r>
+      <w:r>
+        <w:br/>
       </w:r>
       <w:r>
         <w:br/>
@@ -3002,7 +956,7 @@
         <w:rPr>
           <w:rStyle w:val="VerbatimChar"/>
         </w:rPr>
-        <w:t xml:space="preserve">        Q1["Universal Quantum State |Ψ⟩"]</w:t>
+        <w:t xml:space="preserve">    style Ancient fill:#f0fdf4,stroke:#16a34a,stroke-width:2px,color:#166534</w:t>
       </w:r>
       <w:r>
         <w:br/>
@@ -3011,7 +965,7 @@
         <w:rPr>
           <w:rStyle w:val="VerbatimChar"/>
         </w:rPr>
-        <w:t xml:space="preserve">        Q2["Wheeler: 'It from Qubit'"]</w:t>
+        <w:t xml:space="preserve">    style Fallacy fill:#fef2f2,stroke:#ef4444,stroke-width:2px,color:#991b1b</w:t>
       </w:r>
       <w:r>
         <w:br/>
@@ -3020,97 +974,10 @@
         <w:rPr>
           <w:rStyle w:val="VerbatimChar"/>
         </w:rPr>
-        <w:t xml:space="preserve">        Q3["Non-Local Entanglement Network"]</w:t>
-      </w:r>
-      <w:r>
-        <w:br/>
-      </w:r>
-      <w:r>
-        <w:rPr>
-          <w:rStyle w:val="VerbatimChar"/>
-        </w:rPr>
-        <w:t xml:space="preserve">    end</w:t>
-      </w:r>
-      <w:r>
-        <w:br/>
-      </w:r>
-      <w:r>
-        <w:br/>
-      </w:r>
-      <w:r>
-        <w:rPr>
-          <w:rStyle w:val="VerbatimChar"/>
-        </w:rPr>
-        <w:t xml:space="preserve">    L1 &amp; L2 &amp; L3 &amp; L4 --&gt;|Reduced in translation| R1 &amp; R2</w:t>
-      </w:r>
-      <w:r>
-        <w:br/>
-      </w:r>
-      <w:r>
-        <w:rPr>
-          <w:rStyle w:val="VerbatimChar"/>
-        </w:rPr>
-        <w:t xml:space="preserve">    L1 &amp; L2 &amp; L3 &amp; L4 &lt;==&gt;|True Mathematical Isomorphism| Q1 &amp; Q2 &amp; Q3</w:t>
-      </w:r>
-      <w:r>
-        <w:br/>
-      </w:r>
-      <w:r>
-        <w:br/>
-      </w:r>
-      <w:r>
-        <w:rPr>
-          <w:rStyle w:val="VerbatimChar"/>
-        </w:rPr>
-        <w:t xml:space="preserve">    classDef ancient fill:#f0fdf4,stroke:#16a34a,stroke-width:2px;</w:t>
-      </w:r>
-      <w:r>
-        <w:br/>
-      </w:r>
-      <w:r>
-        <w:rPr>
-          <w:rStyle w:val="VerbatimChar"/>
-        </w:rPr>
-        <w:t xml:space="preserve">    classDef reduced fill:#fef2f2,stroke:#ef4444,stroke-width:1.5px;</w:t>
-      </w:r>
-      <w:r>
-        <w:br/>
-      </w:r>
-      <w:r>
-        <w:rPr>
-          <w:rStyle w:val="VerbatimChar"/>
-        </w:rPr>
-        <w:t xml:space="preserve">    classDef modern fill:#eff6ff,stroke:#2563eb,stroke-width:2px;</w:t>
-      </w:r>
-      <w:r>
-        <w:br/>
-      </w:r>
-      <w:r>
-        <w:rPr>
-          <w:rStyle w:val="VerbatimChar"/>
-        </w:rPr>
-        <w:t xml:space="preserve">    class L1,L2,L3,L4 ancient;</w:t>
-      </w:r>
-      <w:r>
-        <w:br/>
-      </w:r>
-      <w:r>
-        <w:rPr>
-          <w:rStyle w:val="VerbatimChar"/>
-        </w:rPr>
-        <w:t xml:space="preserve">    class R1,R2 reduced;</w:t>
-      </w:r>
-      <w:r>
-        <w:br/>
-      </w:r>
-      <w:r>
-        <w:rPr>
-          <w:rStyle w:val="VerbatimChar"/>
-        </w:rPr>
-        <w:t xml:space="preserve">    class Q1,Q2,Q3 modern;</w:t>
-      </w:r>
-    </w:p>
-    <w:bookmarkStart w:id="19" w:name="etymology-and-greek-semantic-breadth"/>
+        <w:t xml:space="preserve">    style Modern fill:#eff6ff,stroke:#2563eb,stroke-width:2px,color:#1e40af</w:t>
+      </w:r>
+    </w:p>
+    <w:bookmarkStart w:id="15" w:name="etymology-and-greek-semantic-breadth"/>
     <w:p>
       <w:pPr>
         <w:pStyle w:val="Heading3"/>
@@ -3348,8 +1215,8 @@
         <w:t xml:space="preserve">commits a category error: It confuses the medium of human speech with the ontological structure of the cosmos.</w:t>
       </w:r>
     </w:p>
-    <w:bookmarkEnd w:id="19"/>
-    <w:bookmarkStart w:id="20" w:name="the-heraclitean-ur-logos"/>
+    <w:bookmarkEnd w:id="15"/>
+    <w:bookmarkStart w:id="16" w:name="the-heraclitean-ur-logos"/>
     <w:p>
       <w:pPr>
         <w:pStyle w:val="Heading3"/>
@@ -3422,8 +1289,8 @@
         <w:t xml:space="preserve">governing cosmic transformation.</w:t>
       </w:r>
     </w:p>
-    <w:bookmarkEnd w:id="20"/>
-    <w:bookmarkStart w:id="21" w:name="the-stoic-logos-spermatikos"/>
+    <w:bookmarkEnd w:id="16"/>
+    <w:bookmarkStart w:id="17" w:name="the-stoic-logos-spermatikos"/>
     <w:p>
       <w:pPr>
         <w:pStyle w:val="Heading3"/>
@@ -3508,8 +1375,8 @@
         <w:t xml:space="preserve">): The generative informational programs that direct the development, morphogenesis, and self-preservation of living organisms.</w:t>
       </w:r>
     </w:p>
-    <w:bookmarkEnd w:id="21"/>
-    <w:bookmarkStart w:id="22" w:name="X327327357006464b3f006fb5f4c4c70e4c33a3d"/>
+    <w:bookmarkEnd w:id="17"/>
+    <w:bookmarkStart w:id="18" w:name="X327327357006464b3f006fb5f4c4c70e4c33a3d"/>
     <w:p>
       <w:pPr>
         <w:pStyle w:val="Heading3"/>
@@ -3619,8 +1486,8 @@
         <w:t xml:space="preserve">): The non-local cohesion preventing cosmic disintegration into chaos.</w:t>
       </w:r>
     </w:p>
-    <w:bookmarkEnd w:id="22"/>
-    <w:bookmarkStart w:id="23" w:name="goethes-faust-the-inadequacy-of-word"/>
+    <w:bookmarkEnd w:id="18"/>
+    <w:bookmarkStart w:id="19" w:name="goethes-faust-the-inadequacy-of-word"/>
     <w:p>
       <w:pPr>
         <w:pStyle w:val="Heading3"/>
@@ -3731,15 +1598,15 @@
         </w:pict>
       </w:r>
     </w:p>
-    <w:bookmarkEnd w:id="23"/>
-    <w:bookmarkEnd w:id="24"/>
-    <w:bookmarkStart w:id="30" w:name="X3a128ad41f6f79a75dd5c338dacd22c18658f4e"/>
+    <w:bookmarkEnd w:id="19"/>
+    <w:bookmarkEnd w:id="20"/>
+    <w:bookmarkStart w:id="26" w:name="X3a128ad41f6f79a75dd5c338dacd22c18658f4e"/>
     <w:p>
       <w:pPr>
         <w:pStyle w:val="Heading2"/>
       </w:pPr>
       <w:r>
-        <w:t xml:space="preserve">4. Isomorphism with Quantum Information Theory (QIT) &amp; the CIF</w:t>
+        <w:t xml:space="preserve">3. Isomorphism with Quantum Information Theory (QIT) &amp; the CIF</w:t>
       </w:r>
     </w:p>
     <w:p>
@@ -3771,7 +1638,7 @@
         <w:rPr>
           <w:rStyle w:val="VerbatimChar"/>
         </w:rPr>
-        <w:t xml:space="preserve">graph TD</w:t>
+        <w:t xml:space="preserve">flowchart TD</w:t>
       </w:r>
       <w:r>
         <w:br/>
@@ -3780,7 +1647,7 @@
         <w:rPr>
           <w:rStyle w:val="VerbatimChar"/>
         </w:rPr>
-        <w:t xml:space="preserve">    J1["1:1: En arche en ho logos"] &lt;--&gt; Q1["Universal State |Ψ⟩ &amp; Wheeler: 'It from Qubit'"]</w:t>
+        <w:t xml:space="preserve">    subgraph V1 ["Verse 1:1 • Ἐν ἀρχῇ ἦν ὁ λόγος"]</w:t>
       </w:r>
       <w:r>
         <w:br/>
@@ -3789,7 +1656,7 @@
         <w:rPr>
           <w:rStyle w:val="VerbatimChar"/>
         </w:rPr>
-        <w:t xml:space="preserve">    J2["1:3: Panta di' autou egeneto"] &lt;--&gt; Q2["Non-Separability, Entanglement &amp; Bell: 2√2 &gt; 2"]</w:t>
+        <w:t xml:space="preserve">        Q1["Universal Quantum Wavefunction |Ψ⟩ &amp; Wheeler's 'It from Qubit'&lt;br/&gt;&lt;i&gt;(Information as primordial ontological ground)&lt;/i&gt;"]</w:t>
       </w:r>
       <w:r>
         <w:br/>
@@ -3798,7 +1665,7 @@
         <w:rPr>
           <w:rStyle w:val="VerbatimChar"/>
         </w:rPr>
-        <w:t xml:space="preserve">    J3["1:4a: En auto zoe en"] &lt;--&gt; Q3["Quantum Darwinism, Pointer States &amp; Markov Blankets (Conatus)"]</w:t>
+        <w:t xml:space="preserve">    end</w:t>
       </w:r>
       <w:r>
         <w:br/>
@@ -3807,7 +1674,7 @@
         <w:rPr>
           <w:rStyle w:val="VerbatimChar"/>
         </w:rPr>
-        <w:t xml:space="preserve">    J4["1:4b-5a: To phos phainei en te skotia"] &lt;--&gt; Q4["Measurement Problem, Participatory Universe &amp; Integrated Information (Φ &gt; 0)"]</w:t>
+        <w:t xml:space="preserve">    subgraph V2 ["Verse 1:3 • Πάντα δι’ αὐτοῦ ἐγένετο"]</w:t>
       </w:r>
       <w:r>
         <w:br/>
@@ -3816,10 +1683,7 @@
         <w:rPr>
           <w:rStyle w:val="VerbatimChar"/>
         </w:rPr>
-        <w:t xml:space="preserve">    J5["1:5b: He skotia auto ou katelaben"] &lt;--&gt; Q5["Unitarity (U†U = I) &amp; Braunstein-Pati No-Hiding Theorem"]</w:t>
-      </w:r>
-      <w:r>
-        <w:br/>
+        <w:t xml:space="preserve">        Q2["Quantum Non-Separability, Entanglement &amp; Bell's Theorem (2√2 &gt; 2)&lt;br/&gt;&lt;i&gt;(Relational holism: no isolated local realism)&lt;/i&gt;"]</w:t>
       </w:r>
       <w:r>
         <w:br/>
@@ -3828,7 +1692,7 @@
         <w:rPr>
           <w:rStyle w:val="VerbatimChar"/>
         </w:rPr>
-        <w:t xml:space="preserve">    classDef verse fill:#f0fdf4,stroke:#16a34a,stroke-width:1.5px;</w:t>
+        <w:t xml:space="preserve">    end</w:t>
       </w:r>
       <w:r>
         <w:br/>
@@ -3837,7 +1701,7 @@
         <w:rPr>
           <w:rStyle w:val="VerbatimChar"/>
         </w:rPr>
-        <w:t xml:space="preserve">    classDef qit fill:#eff6ff,stroke:#2563eb,stroke-width:1.5px;</w:t>
+        <w:t xml:space="preserve">    subgraph V3 ["Verse 1:4a • Ἐν αὐτῷ ζωὴ ἦν"]</w:t>
       </w:r>
       <w:r>
         <w:br/>
@@ -3846,7 +1710,7 @@
         <w:rPr>
           <w:rStyle w:val="VerbatimChar"/>
         </w:rPr>
-        <w:t xml:space="preserve">    class J1,J2,J3,J4,J5 verse;</w:t>
+        <w:t xml:space="preserve">        Q3["Quantum Darwinism, Pointer States &amp; Markov Blankets (Conatus)&lt;br/&gt;&lt;i&gt;(Decoherence shielding &amp; non-equilibrium self-preservation)&lt;/i&gt;"]</w:t>
       </w:r>
       <w:r>
         <w:br/>
@@ -3855,7 +1719,121 @@
         <w:rPr>
           <w:rStyle w:val="VerbatimChar"/>
         </w:rPr>
-        <w:t xml:space="preserve">    class Q1,Q2,Q3,Q4,Q5 qit;</w:t>
+        <w:t xml:space="preserve">    end</w:t>
+      </w:r>
+      <w:r>
+        <w:br/>
+      </w:r>
+      <w:r>
+        <w:rPr>
+          <w:rStyle w:val="VerbatimChar"/>
+        </w:rPr>
+        <w:t xml:space="preserve">    subgraph V4 ["Verse 1:4b–5a • Τὸ φῶς φαίνει ἐν τῇ σκοτίᾳ"]</w:t>
+      </w:r>
+      <w:r>
+        <w:br/>
+      </w:r>
+      <w:r>
+        <w:rPr>
+          <w:rStyle w:val="VerbatimChar"/>
+        </w:rPr>
+        <w:t xml:space="preserve">        Q4["Measurement Problem, Participatory Universe &amp; Integrated Information (Φ &gt; 0)&lt;br/&gt;&lt;i&gt;(1st-person qualia illuminating the dark quantum potential)&lt;/i&gt;"]</w:t>
+      </w:r>
+      <w:r>
+        <w:br/>
+      </w:r>
+      <w:r>
+        <w:rPr>
+          <w:rStyle w:val="VerbatimChar"/>
+        </w:rPr>
+        <w:t xml:space="preserve">    end</w:t>
+      </w:r>
+      <w:r>
+        <w:br/>
+      </w:r>
+      <w:r>
+        <w:rPr>
+          <w:rStyle w:val="VerbatimChar"/>
+        </w:rPr>
+        <w:t xml:space="preserve">    subgraph V5 ["Verse 1:5b • Ἡ σκοτία αὐτὸ οὐ κατέλαβεν"]</w:t>
+      </w:r>
+      <w:r>
+        <w:br/>
+      </w:r>
+      <w:r>
+        <w:rPr>
+          <w:rStyle w:val="VerbatimChar"/>
+        </w:rPr>
+        <w:t xml:space="preserve">        Q5["Global Unitarity (U†U = I) &amp; Braunstein-Pati No-Hiding Theorem&lt;br/&gt;&lt;i&gt;(Absolute conservation of experiential information at death)&lt;/i&gt;"]</w:t>
+      </w:r>
+      <w:r>
+        <w:br/>
+      </w:r>
+      <w:r>
+        <w:rPr>
+          <w:rStyle w:val="VerbatimChar"/>
+        </w:rPr>
+        <w:t xml:space="preserve">    end</w:t>
+      </w:r>
+      <w:r>
+        <w:br/>
+      </w:r>
+      <w:r>
+        <w:br/>
+      </w:r>
+      <w:r>
+        <w:rPr>
+          <w:rStyle w:val="VerbatimChar"/>
+        </w:rPr>
+        <w:t xml:space="preserve">    V1 ==&gt; V2 ==&gt; V3 ==&gt; V4 ==&gt; V5</w:t>
+      </w:r>
+      <w:r>
+        <w:br/>
+      </w:r>
+      <w:r>
+        <w:br/>
+      </w:r>
+      <w:r>
+        <w:rPr>
+          <w:rStyle w:val="VerbatimChar"/>
+        </w:rPr>
+        <w:t xml:space="preserve">    style V1 fill:#f0fdf4,stroke:#16a34a,stroke-width:1.5px</w:t>
+      </w:r>
+      <w:r>
+        <w:br/>
+      </w:r>
+      <w:r>
+        <w:rPr>
+          <w:rStyle w:val="VerbatimChar"/>
+        </w:rPr>
+        <w:t xml:space="preserve">    style V2 fill:#f0fdf4,stroke:#16a34a,stroke-width:1.5px</w:t>
+      </w:r>
+      <w:r>
+        <w:br/>
+      </w:r>
+      <w:r>
+        <w:rPr>
+          <w:rStyle w:val="VerbatimChar"/>
+        </w:rPr>
+        <w:t xml:space="preserve">    style V3 fill:#f0fdf4,stroke:#16a34a,stroke-width:1.5px</w:t>
+      </w:r>
+      <w:r>
+        <w:br/>
+      </w:r>
+      <w:r>
+        <w:rPr>
+          <w:rStyle w:val="VerbatimChar"/>
+        </w:rPr>
+        <w:t xml:space="preserve">    style V4 fill:#f0fdf4,stroke:#16a34a,stroke-width:1.5px</w:t>
+      </w:r>
+      <w:r>
+        <w:br/>
+      </w:r>
+      <w:r>
+        <w:rPr>
+          <w:rStyle w:val="VerbatimChar"/>
+        </w:rPr>
+        <w:t xml:space="preserve">    style V5 fill:#f0fdf4,stroke:#16a34a,stroke-width:1.5px</w:t>
       </w:r>
     </w:p>
     <w:p>
@@ -3865,7 +1843,7 @@
         </w:pict>
       </w:r>
     </w:p>
-    <w:bookmarkStart w:id="25" w:name="X3aebd24420121f36a40d3cf2a326217d3c2fbca"/>
+    <w:bookmarkStart w:id="21" w:name="X3aebd24420121f36a40d3cf2a326217d3c2fbca"/>
     <w:p>
       <w:pPr>
         <w:pStyle w:val="Heading3"/>
@@ -3967,7 +1945,7 @@
         <w:pStyle w:val="Compact"/>
         <w:numPr>
           <w:ilvl w:val="0"/>
-          <w:numId w:val="1001"/>
+          <w:numId w:val="1002"/>
         </w:numPr>
       </w:pPr>
       <w:r>
@@ -4037,7 +2015,7 @@
         <w:pStyle w:val="Compact"/>
         <w:numPr>
           <w:ilvl w:val="0"/>
-          <w:numId w:val="1001"/>
+          <w:numId w:val="1002"/>
         </w:numPr>
       </w:pPr>
       <w:r>
@@ -4130,8 +2108,8 @@
         </w:pict>
       </w:r>
     </w:p>
-    <w:bookmarkEnd w:id="25"/>
-    <w:bookmarkStart w:id="26" w:name="Xc3ec72d40f8c273ba2b95fe4efc9a25a16cc41f"/>
+    <w:bookmarkEnd w:id="21"/>
+    <w:bookmarkStart w:id="22" w:name="Xc3ec72d40f8c273ba2b95fe4efc9a25a16cc41f"/>
     <w:p>
       <w:pPr>
         <w:pStyle w:val="Heading3"/>
@@ -4194,7 +2172,7 @@
         <w:pStyle w:val="Compact"/>
         <w:numPr>
           <w:ilvl w:val="0"/>
-          <w:numId w:val="1002"/>
+          <w:numId w:val="1003"/>
         </w:numPr>
       </w:pPr>
       <w:r>
@@ -4219,7 +2197,7 @@
         <w:pStyle w:val="Compact"/>
         <w:numPr>
           <w:ilvl w:val="0"/>
-          <w:numId w:val="1002"/>
+          <w:numId w:val="1003"/>
         </w:numPr>
       </w:pPr>
       <w:r>
@@ -4419,8 +2397,8 @@
         </w:pict>
       </w:r>
     </w:p>
-    <w:bookmarkEnd w:id="26"/>
-    <w:bookmarkStart w:id="27" w:name="Xf466dfdf74f199a73f65c85b4034abf75b6661d"/>
+    <w:bookmarkEnd w:id="22"/>
+    <w:bookmarkStart w:id="23" w:name="Xf466dfdf74f199a73f65c85b4034abf75b6661d"/>
     <w:p>
       <w:pPr>
         <w:pStyle w:val="Heading3"/>
@@ -4483,7 +2461,7 @@
         <w:pStyle w:val="Compact"/>
         <w:numPr>
           <w:ilvl w:val="0"/>
-          <w:numId w:val="1003"/>
+          <w:numId w:val="1004"/>
         </w:numPr>
       </w:pPr>
       <w:r>
@@ -4518,7 +2496,7 @@
         <w:pStyle w:val="Compact"/>
         <w:numPr>
           <w:ilvl w:val="0"/>
-          <w:numId w:val="1003"/>
+          <w:numId w:val="1004"/>
         </w:numPr>
       </w:pPr>
       <w:r>
@@ -4890,8 +2868,8 @@
         </w:pict>
       </w:r>
     </w:p>
-    <w:bookmarkEnd w:id="27"/>
-    <w:bookmarkStart w:id="28" w:name="X4c30ca9114538ed14478c5b90b365e4ae59b73f"/>
+    <w:bookmarkEnd w:id="23"/>
+    <w:bookmarkStart w:id="24" w:name="X4c30ca9114538ed14478c5b90b365e4ae59b73f"/>
     <w:p>
       <w:pPr>
         <w:pStyle w:val="Heading3"/>
@@ -4974,7 +2952,7 @@
         <w:pStyle w:val="Compact"/>
         <w:numPr>
           <w:ilvl w:val="0"/>
-          <w:numId w:val="1004"/>
+          <w:numId w:val="1005"/>
         </w:numPr>
       </w:pPr>
       <w:r>
@@ -5029,7 +3007,7 @@
         <w:pStyle w:val="Compact"/>
         <w:numPr>
           <w:ilvl w:val="0"/>
-          <w:numId w:val="1004"/>
+          <w:numId w:val="1005"/>
         </w:numPr>
       </w:pPr>
       <w:r>
@@ -5159,8 +3137,8 @@
         </w:pict>
       </w:r>
     </w:p>
-    <w:bookmarkEnd w:id="28"/>
-    <w:bookmarkStart w:id="29" w:name="Xb7e4ffa23ed43fa9fba50b27bdd0908c1ab5c87"/>
+    <w:bookmarkEnd w:id="24"/>
+    <w:bookmarkStart w:id="25" w:name="Xb7e4ffa23ed43fa9fba50b27bdd0908c1ab5c87"/>
     <w:p>
       <w:pPr>
         <w:pStyle w:val="Heading3"/>
@@ -5255,7 +3233,7 @@
         <w:pStyle w:val="Compact"/>
         <w:numPr>
           <w:ilvl w:val="0"/>
-          <w:numId w:val="1005"/>
+          <w:numId w:val="1006"/>
         </w:numPr>
       </w:pPr>
       <w:r>
@@ -5341,7 +3319,7 @@
         <w:pStyle w:val="Compact"/>
         <w:numPr>
           <w:ilvl w:val="1"/>
-          <w:numId w:val="1006"/>
+          <w:numId w:val="1007"/>
         </w:numPr>
       </w:pPr>
       <w:r>
@@ -5363,7 +3341,7 @@
         <w:pStyle w:val="Compact"/>
         <w:numPr>
           <w:ilvl w:val="1"/>
-          <w:numId w:val="1006"/>
+          <w:numId w:val="1007"/>
         </w:numPr>
       </w:pPr>
       <w:r>
@@ -5391,7 +3369,7 @@
         <w:pStyle w:val="Compact"/>
         <w:numPr>
           <w:ilvl w:val="0"/>
-          <w:numId w:val="1005"/>
+          <w:numId w:val="1006"/>
         </w:numPr>
       </w:pPr>
       <w:r>
@@ -5484,7 +3462,7 @@
         <w:pStyle w:val="Compact"/>
         <w:numPr>
           <w:ilvl w:val="0"/>
-          <w:numId w:val="1005"/>
+          <w:numId w:val="1006"/>
         </w:numPr>
       </w:pPr>
       <w:r>
@@ -5522,7 +3500,7 @@
         <w:pStyle w:val="Compact"/>
         <w:numPr>
           <w:ilvl w:val="0"/>
-          <w:numId w:val="1005"/>
+          <w:numId w:val="1006"/>
         </w:numPr>
       </w:pPr>
       <w:r>
@@ -5592,15 +3570,15 @@
         </w:pict>
       </w:r>
     </w:p>
-    <w:bookmarkEnd w:id="29"/>
-    <w:bookmarkEnd w:id="30"/>
-    <w:bookmarkStart w:id="31" w:name="X54eb9168f6cea43a50218a1c8075a727a510521"/>
+    <w:bookmarkEnd w:id="25"/>
+    <w:bookmarkEnd w:id="26"/>
+    <w:bookmarkStart w:id="27" w:name="X54eb9168f6cea43a50218a1c8075a727a510521"/>
     <w:p>
       <w:pPr>
         <w:pStyle w:val="Heading2"/>
       </w:pPr>
       <w:r>
-        <w:t xml:space="preserve">5. Synoptic Matrix: John 1:1–1:5 vs. Quantum Information Theory</w:t>
+        <w:t xml:space="preserve">4. Synoptic Matrix: John 1:1–1:5 vs. Quantum Information Theory</w:t>
       </w:r>
     </w:p>
     <w:tbl>
@@ -6157,14 +4135,14 @@
         </w:pict>
       </w:r>
     </w:p>
-    <w:bookmarkEnd w:id="31"/>
-    <w:bookmarkStart w:id="32" w:name="Xbfa87f6abb6f88b0bc93e2a3063e3ace4127ca1"/>
+    <w:bookmarkEnd w:id="27"/>
+    <w:bookmarkStart w:id="28" w:name="Xbfa87f6abb6f88b0bc93e2a3063e3ace4127ca1"/>
     <w:p>
       <w:pPr>
         <w:pStyle w:val="Heading2"/>
       </w:pPr>
       <w:r>
-        <w:t xml:space="preserve">6. Conclusion: The Foundational Bedrock for</w:t>
+        <w:t xml:space="preserve">5. Conclusion: The Foundational Bedrock for</w:t>
       </w:r>
       <w:r>
         <w:t xml:space="preserve"> </w:t>
@@ -6472,8 +4450,8 @@
         </w:pict>
       </w:r>
     </w:p>
-    <w:bookmarkEnd w:id="32"/>
-    <w:bookmarkStart w:id="33" w:name="references"/>
+    <w:bookmarkEnd w:id="28"/>
+    <w:bookmarkStart w:id="29" w:name="references"/>
     <w:p>
       <w:pPr>
         <w:pStyle w:val="Heading2"/>
@@ -6487,7 +4465,7 @@
         <w:pStyle w:val="Compact"/>
         <w:numPr>
           <w:ilvl w:val="0"/>
-          <w:numId w:val="1007"/>
+          <w:numId w:val="1008"/>
         </w:numPr>
       </w:pPr>
       <w:r>
@@ -6522,7 +4500,7 @@
         <w:pStyle w:val="Compact"/>
         <w:numPr>
           <w:ilvl w:val="0"/>
-          <w:numId w:val="1007"/>
+          <w:numId w:val="1008"/>
         </w:numPr>
       </w:pPr>
       <w:r>
@@ -6557,7 +4535,7 @@
         <w:pStyle w:val="Compact"/>
         <w:numPr>
           <w:ilvl w:val="0"/>
-          <w:numId w:val="1007"/>
+          <w:numId w:val="1008"/>
         </w:numPr>
       </w:pPr>
       <w:r>
@@ -6592,7 +4570,7 @@
         <w:pStyle w:val="Compact"/>
         <w:numPr>
           <w:ilvl w:val="0"/>
-          <w:numId w:val="1007"/>
+          <w:numId w:val="1008"/>
         </w:numPr>
       </w:pPr>
       <w:r>
@@ -6630,7 +4608,7 @@
         <w:pStyle w:val="Compact"/>
         <w:numPr>
           <w:ilvl w:val="0"/>
-          <w:numId w:val="1007"/>
+          <w:numId w:val="1008"/>
         </w:numPr>
       </w:pPr>
       <w:r>
@@ -6665,7 +4643,7 @@
         <w:pStyle w:val="Compact"/>
         <w:numPr>
           <w:ilvl w:val="0"/>
-          <w:numId w:val="1007"/>
+          <w:numId w:val="1008"/>
         </w:numPr>
       </w:pPr>
       <w:r>
@@ -6700,7 +4678,7 @@
         <w:pStyle w:val="Compact"/>
         <w:numPr>
           <w:ilvl w:val="0"/>
-          <w:numId w:val="1007"/>
+          <w:numId w:val="1008"/>
         </w:numPr>
       </w:pPr>
       <w:r>
@@ -6735,7 +4713,7 @@
         <w:pStyle w:val="Compact"/>
         <w:numPr>
           <w:ilvl w:val="0"/>
-          <w:numId w:val="1007"/>
+          <w:numId w:val="1008"/>
         </w:numPr>
       </w:pPr>
       <w:r>
@@ -6770,7 +4748,7 @@
         <w:pStyle w:val="Compact"/>
         <w:numPr>
           <w:ilvl w:val="0"/>
-          <w:numId w:val="1007"/>
+          <w:numId w:val="1008"/>
         </w:numPr>
       </w:pPr>
       <w:r>
@@ -6805,7 +4783,7 @@
         <w:pStyle w:val="Compact"/>
         <w:numPr>
           <w:ilvl w:val="0"/>
-          <w:numId w:val="1007"/>
+          <w:numId w:val="1008"/>
         </w:numPr>
       </w:pPr>
       <w:r>
@@ -6835,8 +4813,8 @@
         <w:t xml:space="preserve">. Nature Physics, 5(3), 181–188.</w:t>
       </w:r>
     </w:p>
-    <w:bookmarkEnd w:id="33"/>
-    <w:bookmarkEnd w:id="34"/>
+    <w:bookmarkEnd w:id="29"/>
+    <w:bookmarkEnd w:id="30"/>
     <w:sectPr>
       <w:footnotePr>
         <w:numRestart w:val="eachSect"/>
@@ -7154,6 +5132,9 @@
     <w:abstractNumId w:val="991"/>
   </w:num>
   <w:num w:numId="1006">
+    <w:abstractNumId w:val="991"/>
+  </w:num>
+  <w:num w:numId="1007">
     <w:abstractNumId w:val="99411"/>
     <w:lvlOverride w:ilvl="0">
       <w:startOverride w:val="1"/>
@@ -7183,7 +5164,7 @@
       <w:startOverride w:val="1"/>
     </w:lvlOverride>
   </w:num>
-  <w:num w:numId="1007">
+  <w:num w:numId="1008">
     <w:abstractNumId w:val="99411"/>
     <w:lvlOverride w:ilvl="0">
       <w:startOverride w:val="1"/>

</xml_diff>